<commit_message>
docs: manuals for 0.3.0 — DOCX and PDF rebuilt (Jira, company structure, transfer, in-app guide)
</commit_message>
<xml_diff>
--- a/docs/manuals/deployment-guide.docx
+++ b/docs/manuals/deployment-guide.docx
@@ -23,7 +23,7 @@
       </w:pPr>
       <w:r>
         <w:rPr/>
-        <w:t>Версия 0.2.1</w:t>
+        <w:t>Версия 0.3.0</w:t>
       </w:r>
     </w:p>
     <w:p>
@@ -93,7 +93,7 @@
             </w:rPr>
             <w:fldChar w:fldCharType="separate"/>
           </w:r>
-          <w:hyperlink w:anchor="__RefHeading___Toc1677_1939341289">
+          <w:hyperlink w:anchor="__RefHeading___Toc1901_34642702">
             <w:r>
               <w:rPr>
                 <w:webHidden/>
@@ -101,7 +101,7 @@
               </w:rPr>
               <w:t>1 О документе</w:t>
               <w:tab/>
-              <w:t>3</w:t>
+              <w:t>4</w:t>
             </w:r>
           </w:hyperlink>
         </w:p>
@@ -114,7 +114,7 @@
             </w:tabs>
             <w:rPr/>
           </w:pPr>
-          <w:hyperlink w:anchor="__RefHeading___Toc1679_1939341289">
+          <w:hyperlink w:anchor="__RefHeading___Toc1903_34642702">
             <w:r>
               <w:rPr>
                 <w:webHidden/>
@@ -122,7 +122,7 @@
               </w:rPr>
               <w:t>2 Архитектура</w:t>
               <w:tab/>
-              <w:t>4</w:t>
+              <w:t>5</w:t>
             </w:r>
           </w:hyperlink>
         </w:p>
@@ -135,7 +135,7 @@
             </w:tabs>
             <w:rPr/>
           </w:pPr>
-          <w:hyperlink w:anchor="__RefHeading___Toc1681_1939341289">
+          <w:hyperlink w:anchor="__RefHeading___Toc1905_34642702">
             <w:r>
               <w:rPr>
                 <w:webHidden/>
@@ -143,7 +143,7 @@
               </w:rPr>
               <w:t>3 Требования</w:t>
               <w:tab/>
-              <w:t>5</w:t>
+              <w:t>6</w:t>
             </w:r>
           </w:hyperlink>
         </w:p>
@@ -156,7 +156,7 @@
             </w:tabs>
             <w:rPr/>
           </w:pPr>
-          <w:hyperlink w:anchor="__RefHeading___Toc1683_1939341289">
+          <w:hyperlink w:anchor="__RefHeading___Toc1907_34642702">
             <w:r>
               <w:rPr>
                 <w:webHidden/>
@@ -164,7 +164,7 @@
               </w:rPr>
               <w:t>3.1 Сервер</w:t>
               <w:tab/>
-              <w:t>5</w:t>
+              <w:t>6</w:t>
             </w:r>
           </w:hyperlink>
         </w:p>
@@ -177,7 +177,7 @@
             </w:tabs>
             <w:rPr/>
           </w:pPr>
-          <w:hyperlink w:anchor="__RefHeading___Toc1685_1939341289">
+          <w:hyperlink w:anchor="__RefHeading___Toc1909_34642702">
             <w:r>
               <w:rPr>
                 <w:webHidden/>
@@ -185,7 +185,7 @@
               </w:rPr>
               <w:t>3.2 Клиенты</w:t>
               <w:tab/>
-              <w:t>5</w:t>
+              <w:t>6</w:t>
             </w:r>
           </w:hyperlink>
         </w:p>
@@ -198,7 +198,7 @@
             </w:tabs>
             <w:rPr/>
           </w:pPr>
-          <w:hyperlink w:anchor="__RefHeading___Toc1687_1939341289">
+          <w:hyperlink w:anchor="__RefHeading___Toc1911_34642702">
             <w:r>
               <w:rPr>
                 <w:webHidden/>
@@ -206,7 +206,7 @@
               </w:rPr>
               <w:t>4 Установка</w:t>
               <w:tab/>
-              <w:t>6</w:t>
+              <w:t>7</w:t>
             </w:r>
           </w:hyperlink>
         </w:p>
@@ -219,7 +219,7 @@
             </w:tabs>
             <w:rPr/>
           </w:pPr>
-          <w:hyperlink w:anchor="__RefHeading___Toc1689_1939341289">
+          <w:hyperlink w:anchor="__RefHeading___Toc1913_34642702">
             <w:r>
               <w:rPr>
                 <w:webHidden/>
@@ -227,7 +227,7 @@
               </w:rPr>
               <w:t>4.1 Шаг 1. Получение дистрибутива</w:t>
               <w:tab/>
-              <w:t>6</w:t>
+              <w:t>7</w:t>
             </w:r>
           </w:hyperlink>
         </w:p>
@@ -240,7 +240,7 @@
             </w:tabs>
             <w:rPr/>
           </w:pPr>
-          <w:hyperlink w:anchor="__RefHeading___Toc1691_1939341289">
+          <w:hyperlink w:anchor="__RefHeading___Toc1915_34642702">
             <w:r>
               <w:rPr>
                 <w:webHidden/>
@@ -248,7 +248,7 @@
               </w:rPr>
               <w:t>4.2 Шаг 2. Конфигурация</w:t>
               <w:tab/>
-              <w:t>6</w:t>
+              <w:t>7</w:t>
             </w:r>
           </w:hyperlink>
         </w:p>
@@ -261,7 +261,7 @@
             </w:tabs>
             <w:rPr/>
           </w:pPr>
-          <w:hyperlink w:anchor="__RefHeading___Toc1693_1939341289">
+          <w:hyperlink w:anchor="__RefHeading___Toc1917_34642702">
             <w:r>
               <w:rPr>
                 <w:webHidden/>
@@ -269,7 +269,7 @@
               </w:rPr>
               <w:t>4.3 Шаг 3. Сборка и запуск</w:t>
               <w:tab/>
-              <w:t>6</w:t>
+              <w:t>7</w:t>
             </w:r>
           </w:hyperlink>
         </w:p>
@@ -282,7 +282,7 @@
             </w:tabs>
             <w:rPr/>
           </w:pPr>
-          <w:hyperlink w:anchor="__RefHeading___Toc1695_1939341289">
+          <w:hyperlink w:anchor="__RefHeading___Toc1919_34642702">
             <w:r>
               <w:rPr>
                 <w:webHidden/>
@@ -290,7 +290,7 @@
               </w:rPr>
               <w:t>4.4 Шаг 4. Проверка</w:t>
               <w:tab/>
-              <w:t>6</w:t>
+              <w:t>7</w:t>
             </w:r>
           </w:hyperlink>
         </w:p>
@@ -303,7 +303,7 @@
             </w:tabs>
             <w:rPr/>
           </w:pPr>
-          <w:hyperlink w:anchor="__RefHeading___Toc1697_1939341289">
+          <w:hyperlink w:anchor="__RefHeading___Toc1921_34642702">
             <w:r>
               <w:rPr>
                 <w:webHidden/>
@@ -311,7 +311,7 @@
               </w:rPr>
               <w:t>4.5 Шаг 5. HTTPS</w:t>
               <w:tab/>
-              <w:t>6</w:t>
+              <w:t>7</w:t>
             </w:r>
           </w:hyperlink>
         </w:p>
@@ -324,7 +324,7 @@
             </w:tabs>
             <w:rPr/>
           </w:pPr>
-          <w:hyperlink w:anchor="__RefHeading___Toc1699_1939341289">
+          <w:hyperlink w:anchor="__RefHeading___Toc1923_34642702">
             <w:r>
               <w:rPr>
                 <w:webHidden/>
@@ -332,7 +332,7 @@
               </w:rPr>
               <w:t>4.6 Шаг 6. Первый вход</w:t>
               <w:tab/>
-              <w:t>7</w:t>
+              <w:t>8</w:t>
             </w:r>
           </w:hyperlink>
         </w:p>
@@ -345,7 +345,7 @@
             </w:tabs>
             <w:rPr/>
           </w:pPr>
-          <w:hyperlink w:anchor="__RefHeading___Toc1701_1939341289">
+          <w:hyperlink w:anchor="__RefHeading___Toc1925_34642702">
             <w:r>
               <w:rPr>
                 <w:webHidden/>
@@ -353,7 +353,7 @@
               </w:rPr>
               <w:t>5 Переход с 1.0.1</w:t>
               <w:tab/>
-              <w:t>8</w:t>
+              <w:t>9</w:t>
             </w:r>
           </w:hyperlink>
         </w:p>
@@ -366,7 +366,7 @@
             </w:tabs>
             <w:rPr/>
           </w:pPr>
-          <w:hyperlink w:anchor="__RefHeading___Toc1703_1939341289">
+          <w:hyperlink w:anchor="__RefHeading___Toc1927_34642702">
             <w:r>
               <w:rPr>
                 <w:webHidden/>
@@ -374,7 +374,7 @@
               </w:rPr>
               <w:t>6 Переменные окружения</w:t>
               <w:tab/>
-              <w:t>9</w:t>
+              <w:t>10</w:t>
             </w:r>
           </w:hyperlink>
         </w:p>
@@ -387,7 +387,7 @@
             </w:tabs>
             <w:rPr/>
           </w:pPr>
-          <w:hyperlink w:anchor="__RefHeading___Toc1705_1939341289">
+          <w:hyperlink w:anchor="__RefHeading___Toc1929_34642702">
             <w:r>
               <w:rPr>
                 <w:webHidden/>
@@ -395,7 +395,7 @@
               </w:rPr>
               <w:t>6.1 Основные</w:t>
               <w:tab/>
-              <w:t>9</w:t>
+              <w:t>10</w:t>
             </w:r>
           </w:hyperlink>
         </w:p>
@@ -408,7 +408,7 @@
             </w:tabs>
             <w:rPr/>
           </w:pPr>
-          <w:hyperlink w:anchor="__RefHeading___Toc1707_1939341289">
+          <w:hyperlink w:anchor="__RefHeading___Toc1931_34642702">
             <w:r>
               <w:rPr>
                 <w:webHidden/>
@@ -416,7 +416,7 @@
               </w:rPr>
               <w:t>6.2 Сессии и безопасность</w:t>
               <w:tab/>
-              <w:t>9</w:t>
+              <w:t>10</w:t>
             </w:r>
           </w:hyperlink>
         </w:p>
@@ -429,7 +429,7 @@
             </w:tabs>
             <w:rPr/>
           </w:pPr>
-          <w:hyperlink w:anchor="__RefHeading___Toc1709_1939341289">
+          <w:hyperlink w:anchor="__RefHeading___Toc1933_34642702">
             <w:r>
               <w:rPr>
                 <w:webHidden/>
@@ -437,7 +437,7 @@
               </w:rPr>
               <w:t>6.3 Работа сервиса</w:t>
               <w:tab/>
-              <w:t>9</w:t>
+              <w:t>10</w:t>
             </w:r>
           </w:hyperlink>
         </w:p>
@@ -450,15 +450,36 @@
             </w:tabs>
             <w:rPr/>
           </w:pPr>
-          <w:hyperlink w:anchor="__RefHeading___Toc1711_1939341289">
+          <w:hyperlink w:anchor="__RefHeading___Toc1935_34642702">
             <w:r>
               <w:rPr>
                 <w:webHidden/>
                 <w:rStyle w:val="IndexLink"/>
               </w:rPr>
-              <w:t>6.4 Резервное копирование</w:t>
+              <w:t>6.4 Jira</w:t>
               <w:tab/>
-              <w:t>10</w:t>
+              <w:t>11</w:t>
+            </w:r>
+          </w:hyperlink>
+        </w:p>
+        <w:p>
+          <w:pPr>
+            <w:pStyle w:val="TOC2"/>
+            <w:tabs>
+              <w:tab w:val="clear" w:pos="9077"/>
+              <w:tab w:val="right" w:pos="9359" w:leader="dot"/>
+            </w:tabs>
+            <w:rPr/>
+          </w:pPr>
+          <w:hyperlink w:anchor="__RefHeading___Toc1937_34642702">
+            <w:r>
+              <w:rPr>
+                <w:webHidden/>
+                <w:rStyle w:val="IndexLink"/>
+              </w:rPr>
+              <w:t>6.5 Резервное копирование</w:t>
+              <w:tab/>
+              <w:t>11</w:t>
             </w:r>
           </w:hyperlink>
         </w:p>
@@ -471,15 +492,36 @@
             </w:tabs>
             <w:rPr/>
           </w:pPr>
-          <w:hyperlink w:anchor="__RefHeading___Toc1713_1939341289">
+          <w:hyperlink w:anchor="__RefHeading___Toc1939_34642702">
             <w:r>
               <w:rPr>
                 <w:webHidden/>
                 <w:rStyle w:val="IndexLink"/>
               </w:rPr>
-              <w:t>7 Резервное копирование и восстановление</w:t>
+              <w:t>7 Структура компании из командной строки</w:t>
               <w:tab/>
-              <w:t>11</w:t>
+              <w:t>12</w:t>
+            </w:r>
+          </w:hyperlink>
+        </w:p>
+        <w:p>
+          <w:pPr>
+            <w:pStyle w:val="TOC1"/>
+            <w:tabs>
+              <w:tab w:val="clear" w:pos="9360"/>
+              <w:tab w:val="right" w:pos="9359" w:leader="dot"/>
+            </w:tabs>
+            <w:rPr/>
+          </w:pPr>
+          <w:hyperlink w:anchor="__RefHeading___Toc1941_34642702">
+            <w:r>
+              <w:rPr>
+                <w:webHidden/>
+                <w:rStyle w:val="IndexLink"/>
+              </w:rPr>
+              <w:t>8 Резервное копирование и восстановление</w:t>
+              <w:tab/>
+              <w:t>13</w:t>
             </w:r>
           </w:hyperlink>
         </w:p>
@@ -492,15 +534,15 @@
             </w:tabs>
             <w:rPr/>
           </w:pPr>
-          <w:hyperlink w:anchor="__RefHeading___Toc1715_1939341289">
+          <w:hyperlink w:anchor="__RefHeading___Toc1943_34642702">
             <w:r>
               <w:rPr>
                 <w:webHidden/>
                 <w:rStyle w:val="IndexLink"/>
               </w:rPr>
-              <w:t>7.1 Копии</w:t>
+              <w:t>8.1 Копии</w:t>
               <w:tab/>
-              <w:t>11</w:t>
+              <w:t>13</w:t>
             </w:r>
           </w:hyperlink>
         </w:p>
@@ -513,15 +555,15 @@
             </w:tabs>
             <w:rPr/>
           </w:pPr>
-          <w:hyperlink w:anchor="__RefHeading___Toc1717_1939341289">
+          <w:hyperlink w:anchor="__RefHeading___Toc1945_34642702">
             <w:r>
               <w:rPr>
                 <w:webHidden/>
                 <w:rStyle w:val="IndexLink"/>
               </w:rPr>
-              <w:t>7.2 Восстановление</w:t>
+              <w:t>8.2 Восстановление</w:t>
               <w:tab/>
-              <w:t>11</w:t>
+              <w:t>13</w:t>
             </w:r>
           </w:hyperlink>
         </w:p>
@@ -534,15 +576,15 @@
             </w:tabs>
             <w:rPr/>
           </w:pPr>
-          <w:hyperlink w:anchor="__RefHeading___Toc1719_1939341289">
+          <w:hyperlink w:anchor="__RefHeading___Toc1947_34642702">
             <w:r>
               <w:rPr>
                 <w:webHidden/>
                 <w:rStyle w:val="IndexLink"/>
               </w:rPr>
-              <w:t>8 Обновление</w:t>
+              <w:t>9 Обновление</w:t>
               <w:tab/>
-              <w:t>12</w:t>
+              <w:t>14</w:t>
             </w:r>
           </w:hyperlink>
         </w:p>
@@ -555,15 +597,15 @@
             </w:tabs>
             <w:rPr/>
           </w:pPr>
-          <w:hyperlink w:anchor="__RefHeading___Toc1721_1939341289">
+          <w:hyperlink w:anchor="__RefHeading___Toc1949_34642702">
             <w:r>
               <w:rPr>
                 <w:webHidden/>
                 <w:rStyle w:val="IndexLink"/>
               </w:rPr>
-              <w:t>8.1 Обычный порядок</w:t>
+              <w:t>9.1 Обычный порядок</w:t>
               <w:tab/>
-              <w:t>12</w:t>
+              <w:t>14</w:t>
             </w:r>
           </w:hyperlink>
         </w:p>
@@ -576,15 +618,15 @@
             </w:tabs>
             <w:rPr/>
           </w:pPr>
-          <w:hyperlink w:anchor="__RefHeading___Toc1723_1939341289">
+          <w:hyperlink w:anchor="__RefHeading___Toc1951_34642702">
             <w:r>
               <w:rPr>
                 <w:webHidden/>
                 <w:rStyle w:val="IndexLink"/>
               </w:rPr>
-              <w:t>8.2 Откат</w:t>
+              <w:t>9.2 Откат</w:t>
               <w:tab/>
-              <w:t>12</w:t>
+              <w:t>14</w:t>
             </w:r>
           </w:hyperlink>
         </w:p>
@@ -597,15 +639,15 @@
             </w:tabs>
             <w:rPr/>
           </w:pPr>
-          <w:hyperlink w:anchor="__RefHeading___Toc1725_1939341289">
+          <w:hyperlink w:anchor="__RefHeading___Toc1953_34642702">
             <w:r>
               <w:rPr>
                 <w:webHidden/>
                 <w:rStyle w:val="IndexLink"/>
               </w:rPr>
-              <w:t>9 Наблюдение и журналы</w:t>
+              <w:t>10 Наблюдение и журналы</w:t>
               <w:tab/>
-              <w:t>13</w:t>
+              <w:t>15</w:t>
             </w:r>
           </w:hyperlink>
         </w:p>
@@ -618,15 +660,15 @@
             </w:tabs>
             <w:rPr/>
           </w:pPr>
-          <w:hyperlink w:anchor="__RefHeading___Toc1727_1939341289">
+          <w:hyperlink w:anchor="__RefHeading___Toc1955_34642702">
             <w:r>
               <w:rPr>
                 <w:webHidden/>
                 <w:rStyle w:val="IndexLink"/>
               </w:rPr>
-              <w:t>9.1 Проверки</w:t>
+              <w:t>10.1 Проверки</w:t>
               <w:tab/>
-              <w:t>13</w:t>
+              <w:t>15</w:t>
             </w:r>
           </w:hyperlink>
         </w:p>
@@ -639,15 +681,15 @@
             </w:tabs>
             <w:rPr/>
           </w:pPr>
-          <w:hyperlink w:anchor="__RefHeading___Toc1729_1939341289">
+          <w:hyperlink w:anchor="__RefHeading___Toc1957_34642702">
             <w:r>
               <w:rPr>
                 <w:webHidden/>
                 <w:rStyle w:val="IndexLink"/>
               </w:rPr>
-              <w:t>9.2 Журналы</w:t>
+              <w:t>10.2 Журналы</w:t>
               <w:tab/>
-              <w:t>13</w:t>
+              <w:t>15</w:t>
             </w:r>
           </w:hyperlink>
         </w:p>
@@ -660,15 +702,15 @@
             </w:tabs>
             <w:rPr/>
           </w:pPr>
-          <w:hyperlink w:anchor="__RefHeading___Toc1731_1939341289">
+          <w:hyperlink w:anchor="__RefHeading___Toc1959_34642702">
             <w:r>
               <w:rPr>
                 <w:webHidden/>
                 <w:rStyle w:val="IndexLink"/>
               </w:rPr>
-              <w:t>10 Безопасность</w:t>
+              <w:t>11 Безопасность</w:t>
               <w:tab/>
-              <w:t>14</w:t>
+              <w:t>16</w:t>
             </w:r>
           </w:hyperlink>
         </w:p>
@@ -681,15 +723,15 @@
             </w:tabs>
             <w:rPr/>
           </w:pPr>
-          <w:hyperlink w:anchor="__RefHeading___Toc1733_1939341289">
+          <w:hyperlink w:anchor="__RefHeading___Toc1961_34642702">
             <w:r>
               <w:rPr>
                 <w:webHidden/>
                 <w:rStyle w:val="IndexLink"/>
               </w:rPr>
-              <w:t>11 Масштабирование</w:t>
+              <w:t>12 Масштабирование</w:t>
               <w:tab/>
-              <w:t>15</w:t>
+              <w:t>17</w:t>
             </w:r>
           </w:hyperlink>
         </w:p>
@@ -702,15 +744,15 @@
             </w:tabs>
             <w:rPr/>
           </w:pPr>
-          <w:hyperlink w:anchor="__RefHeading___Toc1735_1939341289">
+          <w:hyperlink w:anchor="__RefHeading___Toc1963_34642702">
             <w:r>
               <w:rPr>
                 <w:webHidden/>
                 <w:rStyle w:val="IndexLink"/>
               </w:rPr>
-              <w:t>12 Установка в закрытом контуре</w:t>
+              <w:t>13 Установка в закрытом контуре</w:t>
               <w:tab/>
-              <w:t>16</w:t>
+              <w:t>18</w:t>
             </w:r>
           </w:hyperlink>
         </w:p>
@@ -723,15 +765,15 @@
             </w:tabs>
             <w:rPr/>
           </w:pPr>
-          <w:hyperlink w:anchor="__RefHeading___Toc1737_1939341289">
+          <w:hyperlink w:anchor="__RefHeading___Toc1965_34642702">
             <w:r>
               <w:rPr>
                 <w:webHidden/>
                 <w:rStyle w:val="IndexLink"/>
               </w:rPr>
-              <w:t>13 Диагностика</w:t>
+              <w:t>14 Диагностика</w:t>
               <w:tab/>
-              <w:t>17</w:t>
+              <w:t>19</w:t>
             </w:r>
           </w:hyperlink>
         </w:p>
@@ -744,15 +786,15 @@
             </w:tabs>
             <w:rPr/>
           </w:pPr>
-          <w:hyperlink w:anchor="__RefHeading___Toc1739_1939341289">
+          <w:hyperlink w:anchor="__RefHeading___Toc1967_34642702">
             <w:r>
               <w:rPr>
                 <w:webHidden/>
                 <w:rStyle w:val="IndexLink"/>
               </w:rPr>
-              <w:t>14 Справочник команд</w:t>
+              <w:t>15 Справочник команд</w:t>
               <w:tab/>
-              <w:t>18</w:t>
+              <w:t>20</w:t>
             </w:r>
           </w:hyperlink>
           <w:r>
@@ -769,7 +811,7 @@
         <w:pStyle w:val="Heading1"/>
         <w:rPr/>
       </w:pPr>
-      <w:bookmarkStart w:id="0" w:name="__RefHeading___Toc1677_1939341289"/>
+      <w:bookmarkStart w:id="0" w:name="__RefHeading___Toc1901_34642702"/>
       <w:bookmarkStart w:id="1" w:name="о-документе"/>
       <w:bookmarkEnd w:id="0"/>
       <w:r>
@@ -792,7 +834,7 @@
       <w:bookmarkStart w:id="2" w:name="о-документе"/>
       <w:r>
         <w:rPr/>
-        <w:t>Руководство описывает установку «Пульса Проекта» версии 0.2.1 на сервер компании, переход с версии 1.0.1, настройку HTTPS, резервное копирование и восстановление, обновление, наблюдение и диагностику. Документ предназначен для инженеров сопровождения. Работа в системе описана в руководствах пользователя и администратора.</w:t>
+        <w:t>Руководство описывает установку «Пульса Проекта» версии 0.3.0 на сервер компании, переход с версии 1.0.1, настройку HTTPS, резервное копирование и восстановление, обновление, наблюдение и диагностику. Документ предназначен для инженеров сопровождения. Работа в системе описана в руководствах пользователя и администратора.</w:t>
       </w:r>
       <w:bookmarkEnd w:id="2"/>
     </w:p>
@@ -801,7 +843,7 @@
         <w:pStyle w:val="Heading1"/>
         <w:rPr/>
       </w:pPr>
-      <w:bookmarkStart w:id="3" w:name="__RefHeading___Toc1679_1939341289"/>
+      <w:bookmarkStart w:id="3" w:name="__RefHeading___Toc1903_34642702"/>
       <w:bookmarkStart w:id="4" w:name="архитектура"/>
       <w:bookmarkEnd w:id="3"/>
       <w:r>
@@ -954,7 +996,7 @@
         <w:pStyle w:val="Heading1"/>
         <w:rPr/>
       </w:pPr>
-      <w:bookmarkStart w:id="5" w:name="__RefHeading___Toc1681_1939341289"/>
+      <w:bookmarkStart w:id="5" w:name="__RefHeading___Toc1905_34642702"/>
       <w:bookmarkStart w:id="6" w:name="требования"/>
       <w:bookmarkEnd w:id="5"/>
       <w:r>
@@ -974,7 +1016,7 @@
         <w:pStyle w:val="Heading2"/>
         <w:rPr/>
       </w:pPr>
-      <w:bookmarkStart w:id="7" w:name="__RefHeading___Toc1683_1939341289"/>
+      <w:bookmarkStart w:id="7" w:name="__RefHeading___Toc1907_34642702"/>
       <w:bookmarkStart w:id="8" w:name="сервер"/>
       <w:bookmarkEnd w:id="7"/>
       <w:r>
@@ -1005,8 +1047,8 @@
         <w:tblLook w:val="0020" w:noHBand="0" w:noVBand="0" w:firstColumn="0" w:lastRow="0" w:lastColumn="0" w:firstRow="1"/>
       </w:tblPr>
       <w:tblGrid>
-        <w:gridCol w:w="1336"/>
-        <w:gridCol w:w="8023"/>
+        <w:gridCol w:w="1318"/>
+        <w:gridCol w:w="8041"/>
       </w:tblGrid>
       <w:tr>
         <w:trPr>
@@ -1014,7 +1056,7 @@
         </w:trPr>
         <w:tc>
           <w:tcPr>
-            <w:tcW w:w="1336" w:type="dxa"/>
+            <w:tcW w:w="1318" w:type="dxa"/>
             <w:tcBorders>
               <w:top w:val="single" w:sz="4" w:space="0" w:color="D6DCEA"/>
               <w:left w:val="single" w:sz="4" w:space="0" w:color="D6DCEA"/>
@@ -1050,7 +1092,7 @@
         </w:tc>
         <w:tc>
           <w:tcPr>
-            <w:tcW w:w="8023" w:type="dxa"/>
+            <w:tcW w:w="8041" w:type="dxa"/>
             <w:tcBorders>
               <w:top w:val="single" w:sz="4" w:space="0" w:color="D6DCEA"/>
               <w:left w:val="single" w:sz="4" w:space="0" w:color="D6DCEA"/>
@@ -1089,7 +1131,7 @@
         <w:trPr/>
         <w:tc>
           <w:tcPr>
-            <w:tcW w:w="1336" w:type="dxa"/>
+            <w:tcW w:w="1318" w:type="dxa"/>
             <w:tcBorders>
               <w:top w:val="single" w:sz="4" w:space="0" w:color="D6DCEA"/>
               <w:left w:val="single" w:sz="4" w:space="0" w:color="D6DCEA"/>
@@ -1122,7 +1164,7 @@
         </w:tc>
         <w:tc>
           <w:tcPr>
-            <w:tcW w:w="8023" w:type="dxa"/>
+            <w:tcW w:w="8041" w:type="dxa"/>
             <w:tcBorders>
               <w:top w:val="single" w:sz="4" w:space="0" w:color="D6DCEA"/>
               <w:left w:val="single" w:sz="4" w:space="0" w:color="D6DCEA"/>
@@ -1158,7 +1200,7 @@
         <w:trPr/>
         <w:tc>
           <w:tcPr>
-            <w:tcW w:w="1336" w:type="dxa"/>
+            <w:tcW w:w="1318" w:type="dxa"/>
             <w:tcBorders>
               <w:top w:val="single" w:sz="4" w:space="0" w:color="D6DCEA"/>
               <w:left w:val="single" w:sz="4" w:space="0" w:color="D6DCEA"/>
@@ -1191,7 +1233,7 @@
         </w:tc>
         <w:tc>
           <w:tcPr>
-            <w:tcW w:w="8023" w:type="dxa"/>
+            <w:tcW w:w="8041" w:type="dxa"/>
             <w:tcBorders>
               <w:top w:val="single" w:sz="4" w:space="0" w:color="D6DCEA"/>
               <w:left w:val="single" w:sz="4" w:space="0" w:color="D6DCEA"/>
@@ -1246,7 +1288,7 @@
         <w:trPr/>
         <w:tc>
           <w:tcPr>
-            <w:tcW w:w="1336" w:type="dxa"/>
+            <w:tcW w:w="1318" w:type="dxa"/>
             <w:tcBorders>
               <w:top w:val="single" w:sz="4" w:space="0" w:color="D6DCEA"/>
               <w:left w:val="single" w:sz="4" w:space="0" w:color="D6DCEA"/>
@@ -1279,7 +1321,7 @@
         </w:tc>
         <w:tc>
           <w:tcPr>
-            <w:tcW w:w="8023" w:type="dxa"/>
+            <w:tcW w:w="8041" w:type="dxa"/>
             <w:tcBorders>
               <w:top w:val="single" w:sz="4" w:space="0" w:color="D6DCEA"/>
               <w:left w:val="single" w:sz="4" w:space="0" w:color="D6DCEA"/>
@@ -1315,7 +1357,7 @@
         <w:trPr/>
         <w:tc>
           <w:tcPr>
-            <w:tcW w:w="1336" w:type="dxa"/>
+            <w:tcW w:w="1318" w:type="dxa"/>
             <w:tcBorders>
               <w:top w:val="single" w:sz="4" w:space="0" w:color="D6DCEA"/>
               <w:left w:val="single" w:sz="4" w:space="0" w:color="D6DCEA"/>
@@ -1348,7 +1390,7 @@
         </w:tc>
         <w:tc>
           <w:tcPr>
-            <w:tcW w:w="8023" w:type="dxa"/>
+            <w:tcW w:w="8041" w:type="dxa"/>
             <w:tcBorders>
               <w:top w:val="single" w:sz="4" w:space="0" w:color="D6DCEA"/>
               <w:left w:val="single" w:sz="4" w:space="0" w:color="D6DCEA"/>
@@ -1384,7 +1426,7 @@
         <w:trPr/>
         <w:tc>
           <w:tcPr>
-            <w:tcW w:w="1336" w:type="dxa"/>
+            <w:tcW w:w="1318" w:type="dxa"/>
             <w:tcBorders>
               <w:top w:val="single" w:sz="4" w:space="0" w:color="D6DCEA"/>
               <w:left w:val="single" w:sz="4" w:space="0" w:color="D6DCEA"/>
@@ -1417,7 +1459,7 @@
         </w:tc>
         <w:tc>
           <w:tcPr>
-            <w:tcW w:w="8023" w:type="dxa"/>
+            <w:tcW w:w="8041" w:type="dxa"/>
             <w:tcBorders>
               <w:top w:val="single" w:sz="4" w:space="0" w:color="D6DCEA"/>
               <w:left w:val="single" w:sz="4" w:space="0" w:color="D6DCEA"/>
@@ -1444,7 +1486,26 @@
                 <w:szCs w:val="24"/>
                 <w:lang w:val="ru-RU" w:eastAsia="en-US" w:bidi="ar-SA"/>
               </w:rPr>
-              <w:t>Порт 39663 (или 443 через HTTPS-прокси); при сборке — доступ к реестру образов, PyPI и npm (или закрытый контур, см. ниже)</w:t>
+              <w:t xml:space="preserve">Порт 39663 (или 443 через HTTPS-прокси); при сборке — доступ к реестру образов, PyPI и npm (или закрытый контур, см. ниже); для связи с Jira — доступ backend к адресу Jira (напрямую или через прокси </w:t>
+            </w:r>
+            <w:r>
+              <w:rPr>
+                <w:rStyle w:val="VerbatimChar"/>
+                <w:kern w:val="0"/>
+                <w:sz w:val="18"/>
+                <w:szCs w:val="24"/>
+                <w:lang w:val="ru-RU" w:eastAsia="en-US" w:bidi="ar-SA"/>
+              </w:rPr>
+              <w:t>HTTPS_PROXY</w:t>
+            </w:r>
+            <w:r>
+              <w:rPr>
+                <w:kern w:val="0"/>
+                <w:sz w:val="18"/>
+                <w:szCs w:val="24"/>
+                <w:lang w:val="ru-RU" w:eastAsia="en-US" w:bidi="ar-SA"/>
+              </w:rPr>
+              <w:t>)</w:t>
             </w:r>
           </w:p>
         </w:tc>
@@ -1476,7 +1537,7 @@
         <w:pStyle w:val="Heading2"/>
         <w:rPr/>
       </w:pPr>
-      <w:bookmarkStart w:id="9" w:name="__RefHeading___Toc1685_1939341289"/>
+      <w:bookmarkStart w:id="9" w:name="__RefHeading___Toc1909_34642702"/>
       <w:bookmarkStart w:id="10" w:name="клиенты"/>
       <w:bookmarkEnd w:id="9"/>
       <w:r>
@@ -1510,7 +1571,7 @@
         <w:pStyle w:val="Heading1"/>
         <w:rPr/>
       </w:pPr>
-      <w:bookmarkStart w:id="13" w:name="__RefHeading___Toc1687_1939341289"/>
+      <w:bookmarkStart w:id="13" w:name="__RefHeading___Toc1911_34642702"/>
       <w:bookmarkStart w:id="14" w:name="установка"/>
       <w:bookmarkEnd w:id="13"/>
       <w:r>
@@ -1530,7 +1591,7 @@
         <w:pStyle w:val="Heading2"/>
         <w:rPr/>
       </w:pPr>
-      <w:bookmarkStart w:id="15" w:name="__RefHeading___Toc1689_1939341289"/>
+      <w:bookmarkStart w:id="15" w:name="__RefHeading___Toc1913_34642702"/>
       <w:bookmarkStart w:id="16" w:name="шаг-1.-получение-дистрибутива"/>
       <w:bookmarkEnd w:id="15"/>
       <w:r>
@@ -1572,7 +1633,7 @@
         <w:rPr>
           <w:rStyle w:val="NormalTok"/>
         </w:rPr>
-        <w:t xml:space="preserve"> v0.2.1 </w:t>
+        <w:t xml:space="preserve"> v0.3.0 </w:t>
       </w:r>
       <w:r>
         <w:rPr>
@@ -1621,7 +1682,7 @@
         <w:pStyle w:val="Heading2"/>
         <w:rPr/>
       </w:pPr>
-      <w:bookmarkStart w:id="17" w:name="__RefHeading___Toc1691_1939341289"/>
+      <w:bookmarkStart w:id="17" w:name="__RefHeading___Toc1915_34642702"/>
       <w:bookmarkStart w:id="18" w:name="шаг-2.-конфигурация"/>
       <w:bookmarkEnd w:id="17"/>
       <w:r>
@@ -1810,7 +1871,7 @@
         <w:pStyle w:val="Heading2"/>
         <w:rPr/>
       </w:pPr>
-      <w:bookmarkStart w:id="19" w:name="__RefHeading___Toc1693_1939341289"/>
+      <w:bookmarkStart w:id="19" w:name="__RefHeading___Toc1917_34642702"/>
       <w:bookmarkStart w:id="20" w:name="шаг-3.-сборка-и-запуск"/>
       <w:bookmarkEnd w:id="19"/>
       <w:r>
@@ -1953,7 +2014,7 @@
         <w:pStyle w:val="Heading2"/>
         <w:rPr/>
       </w:pPr>
-      <w:bookmarkStart w:id="21" w:name="__RefHeading___Toc1695_1939341289"/>
+      <w:bookmarkStart w:id="21" w:name="__RefHeading___Toc1919_34642702"/>
       <w:bookmarkStart w:id="22" w:name="шаг-4.-проверка"/>
       <w:bookmarkEnd w:id="21"/>
       <w:r>
@@ -2023,7 +2084,7 @@
         <w:rPr>
           <w:rStyle w:val="CommentTok"/>
         </w:rPr>
-        <w:t># {"status":"ok","schema":"0001_initial","version":"0.2.1"}</w:t>
+        <w:t># {"status":"ok","schema":"0004_department_access","version":"0.3.0"}</w:t>
       </w:r>
       <w:r>
         <w:rPr/>
@@ -2116,7 +2177,7 @@
         <w:pStyle w:val="Heading2"/>
         <w:rPr/>
       </w:pPr>
-      <w:bookmarkStart w:id="23" w:name="__RefHeading___Toc1697_1939341289"/>
+      <w:bookmarkStart w:id="23" w:name="__RefHeading___Toc1921_34642702"/>
       <w:bookmarkStart w:id="24" w:name="шаг-5.-https"/>
       <w:bookmarkEnd w:id="23"/>
       <w:r>
@@ -2445,7 +2506,7 @@
         <w:pStyle w:val="Heading2"/>
         <w:rPr/>
       </w:pPr>
-      <w:bookmarkStart w:id="25" w:name="__RefHeading___Toc1699_1939341289"/>
+      <w:bookmarkStart w:id="25" w:name="__RefHeading___Toc1923_34642702"/>
       <w:bookmarkStart w:id="26" w:name="шаг-6.-первый-вход"/>
       <w:bookmarkEnd w:id="25"/>
       <w:r>
@@ -2529,7 +2590,7 @@
         <w:pStyle w:val="Heading1"/>
         <w:rPr/>
       </w:pPr>
-      <w:bookmarkStart w:id="27" w:name="__RefHeading___Toc1701_1939341289"/>
+      <w:bookmarkStart w:id="27" w:name="__RefHeading___Toc1925_34642702"/>
       <w:bookmarkStart w:id="28" w:name="переход-с-1.0.1"/>
       <w:bookmarkEnd w:id="27"/>
       <w:r>
@@ -2781,7 +2842,7 @@
         <w:pStyle w:val="Heading1"/>
         <w:rPr/>
       </w:pPr>
-      <w:bookmarkStart w:id="30" w:name="__RefHeading___Toc1703_1939341289"/>
+      <w:bookmarkStart w:id="30" w:name="__RefHeading___Toc1927_34642702"/>
       <w:bookmarkEnd w:id="30"/>
       <w:r>
         <w:rPr>
@@ -2800,7 +2861,7 @@
         <w:pStyle w:val="Heading2"/>
         <w:rPr/>
       </w:pPr>
-      <w:bookmarkStart w:id="31" w:name="__RefHeading___Toc1705_1939341289"/>
+      <w:bookmarkStart w:id="31" w:name="__RefHeading___Toc1929_34642702"/>
       <w:bookmarkEnd w:id="31"/>
       <w:r>
         <w:rPr>
@@ -3822,7 +3883,7 @@
         <w:pStyle w:val="Heading2"/>
         <w:rPr/>
       </w:pPr>
-      <w:bookmarkStart w:id="33" w:name="__RefHeading___Toc1707_1939341289"/>
+      <w:bookmarkStart w:id="33" w:name="__RefHeading___Toc1931_34642702"/>
       <w:bookmarkEnd w:id="33"/>
       <w:r>
         <w:rPr>
@@ -4505,7 +4566,7 @@
         <w:pStyle w:val="Heading2"/>
         <w:rPr/>
       </w:pPr>
-      <w:bookmarkStart w:id="34" w:name="__RefHeading___Toc1709_1939341289"/>
+      <w:bookmarkStart w:id="34" w:name="__RefHeading___Toc1933_34642702"/>
       <w:bookmarkEnd w:id="34"/>
       <w:r>
         <w:rPr>
@@ -5073,13 +5134,582 @@
         <w:pStyle w:val="Heading2"/>
         <w:rPr/>
       </w:pPr>
-      <w:bookmarkStart w:id="35" w:name="__RefHeading___Toc1711_1939341289"/>
+      <w:bookmarkStart w:id="35" w:name="__RefHeading___Toc1935_34642702"/>
       <w:bookmarkEnd w:id="35"/>
       <w:r>
         <w:rPr>
           <w:rStyle w:val="SectionNumber"/>
         </w:rPr>
         <w:t>6.4</w:t>
+      </w:r>
+      <w:r>
+        <w:rPr/>
+        <w:tab/>
+        <w:t>Jira</w:t>
+      </w:r>
+    </w:p>
+    <w:tbl>
+      <w:tblPr>
+        <w:tblStyle w:val="Table"/>
+        <w:tblW w:w="5000" w:type="pct"/>
+        <w:jc w:val="center"/>
+        <w:tblInd w:w="0" w:type="dxa"/>
+        <w:tblLayout w:type="fixed"/>
+        <w:tblCellMar>
+          <w:top w:w="0" w:type="dxa"/>
+          <w:left w:w="108" w:type="dxa"/>
+          <w:bottom w:w="0" w:type="dxa"/>
+          <w:right w:w="108" w:type="dxa"/>
+        </w:tblCellMar>
+        <w:tblLook w:val="0020" w:noHBand="0" w:noVBand="0" w:firstColumn="0" w:lastRow="0" w:lastColumn="0" w:firstRow="1"/>
+      </w:tblPr>
+      <w:tblGrid>
+        <w:gridCol w:w="2451"/>
+        <w:gridCol w:w="1226"/>
+        <w:gridCol w:w="5683"/>
+      </w:tblGrid>
+      <w:tr>
+        <w:trPr>
+          <w:tblHeader w:val="true"/>
+        </w:trPr>
+        <w:tc>
+          <w:tcPr>
+            <w:tcW w:w="2451" w:type="dxa"/>
+            <w:tcBorders>
+              <w:top w:val="single" w:sz="4" w:space="0" w:color="D6DCEA"/>
+              <w:left w:val="single" w:sz="4" w:space="0" w:color="D6DCEA"/>
+              <w:bottom w:val="single" w:sz="6" w:space="0" w:color="000000"/>
+              <w:right w:val="single" w:sz="4" w:space="0" w:color="D6DCEA"/>
+            </w:tcBorders>
+            <w:shd w:color="auto" w:fill="EEF2FB" w:val="clear"/>
+            <w:vAlign w:val="bottom"/>
+          </w:tcPr>
+          <w:p>
+            <w:pPr>
+              <w:pStyle w:val="Compact"/>
+              <w:widowControl/>
+              <w:spacing w:before="36" w:after="40"/>
+              <w:jc w:val="left"/>
+              <w:rPr>
+                <w:kern w:val="0"/>
+                <w:szCs w:val="24"/>
+                <w:lang w:val="ru-RU" w:eastAsia="en-US" w:bidi="ar-SA"/>
+              </w:rPr>
+            </w:pPr>
+            <w:r>
+              <w:rPr>
+                <w:b/>
+                <w:kern w:val="0"/>
+                <w:sz w:val="18"/>
+                <w:szCs w:val="24"/>
+                <w:lang w:val="ru-RU" w:eastAsia="en-US" w:bidi="ar-SA"/>
+              </w:rPr>
+              <w:t>Переменная</w:t>
+            </w:r>
+          </w:p>
+        </w:tc>
+        <w:tc>
+          <w:tcPr>
+            <w:tcW w:w="1226" w:type="dxa"/>
+            <w:tcBorders>
+              <w:top w:val="single" w:sz="4" w:space="0" w:color="D6DCEA"/>
+              <w:left w:val="single" w:sz="4" w:space="0" w:color="D6DCEA"/>
+              <w:bottom w:val="single" w:sz="6" w:space="0" w:color="000000"/>
+              <w:right w:val="single" w:sz="4" w:space="0" w:color="D6DCEA"/>
+            </w:tcBorders>
+            <w:shd w:color="auto" w:fill="EEF2FB" w:val="clear"/>
+            <w:vAlign w:val="bottom"/>
+          </w:tcPr>
+          <w:p>
+            <w:pPr>
+              <w:pStyle w:val="Compact"/>
+              <w:widowControl/>
+              <w:spacing w:before="36" w:after="40"/>
+              <w:jc w:val="left"/>
+              <w:rPr>
+                <w:kern w:val="0"/>
+                <w:szCs w:val="24"/>
+                <w:lang w:val="ru-RU" w:eastAsia="en-US" w:bidi="ar-SA"/>
+              </w:rPr>
+            </w:pPr>
+            <w:r>
+              <w:rPr>
+                <w:b/>
+                <w:kern w:val="0"/>
+                <w:sz w:val="18"/>
+                <w:szCs w:val="24"/>
+                <w:lang w:val="ru-RU" w:eastAsia="en-US" w:bidi="ar-SA"/>
+              </w:rPr>
+              <w:t>По умолчанию</w:t>
+            </w:r>
+          </w:p>
+        </w:tc>
+        <w:tc>
+          <w:tcPr>
+            <w:tcW w:w="5683" w:type="dxa"/>
+            <w:tcBorders>
+              <w:top w:val="single" w:sz="4" w:space="0" w:color="D6DCEA"/>
+              <w:left w:val="single" w:sz="4" w:space="0" w:color="D6DCEA"/>
+              <w:bottom w:val="single" w:sz="6" w:space="0" w:color="000000"/>
+              <w:right w:val="single" w:sz="4" w:space="0" w:color="D6DCEA"/>
+            </w:tcBorders>
+            <w:shd w:color="auto" w:fill="EEF2FB" w:val="clear"/>
+            <w:vAlign w:val="bottom"/>
+          </w:tcPr>
+          <w:p>
+            <w:pPr>
+              <w:pStyle w:val="Compact"/>
+              <w:widowControl/>
+              <w:spacing w:before="36" w:after="40"/>
+              <w:jc w:val="left"/>
+              <w:rPr>
+                <w:kern w:val="0"/>
+                <w:szCs w:val="24"/>
+                <w:lang w:val="ru-RU" w:eastAsia="en-US" w:bidi="ar-SA"/>
+              </w:rPr>
+            </w:pPr>
+            <w:r>
+              <w:rPr>
+                <w:b/>
+                <w:kern w:val="0"/>
+                <w:sz w:val="18"/>
+                <w:szCs w:val="24"/>
+                <w:lang w:val="ru-RU" w:eastAsia="en-US" w:bidi="ar-SA"/>
+              </w:rPr>
+              <w:t>Назначение</w:t>
+            </w:r>
+          </w:p>
+        </w:tc>
+      </w:tr>
+      <w:tr>
+        <w:trPr/>
+        <w:tc>
+          <w:tcPr>
+            <w:tcW w:w="2451" w:type="dxa"/>
+            <w:tcBorders>
+              <w:top w:val="single" w:sz="4" w:space="0" w:color="D6DCEA"/>
+              <w:left w:val="single" w:sz="4" w:space="0" w:color="D6DCEA"/>
+              <w:bottom w:val="single" w:sz="4" w:space="0" w:color="D6DCEA"/>
+              <w:right w:val="single" w:sz="4" w:space="0" w:color="D6DCEA"/>
+            </w:tcBorders>
+          </w:tcPr>
+          <w:p>
+            <w:pPr>
+              <w:pStyle w:val="Compact"/>
+              <w:widowControl/>
+              <w:spacing w:before="36" w:after="40"/>
+              <w:jc w:val="left"/>
+              <w:rPr>
+                <w:kern w:val="0"/>
+                <w:szCs w:val="24"/>
+                <w:lang w:val="ru-RU" w:eastAsia="en-US" w:bidi="ar-SA"/>
+              </w:rPr>
+            </w:pPr>
+            <w:r>
+              <w:rPr>
+                <w:rStyle w:val="VerbatimChar"/>
+                <w:kern w:val="0"/>
+                <w:sz w:val="18"/>
+                <w:szCs w:val="24"/>
+                <w:lang w:val="ru-RU" w:eastAsia="en-US" w:bidi="ar-SA"/>
+              </w:rPr>
+              <w:t>JIRA_ALLOWED_HOSTS</w:t>
+            </w:r>
+          </w:p>
+        </w:tc>
+        <w:tc>
+          <w:tcPr>
+            <w:tcW w:w="1226" w:type="dxa"/>
+            <w:tcBorders>
+              <w:top w:val="single" w:sz="4" w:space="0" w:color="D6DCEA"/>
+              <w:left w:val="single" w:sz="4" w:space="0" w:color="D6DCEA"/>
+              <w:bottom w:val="single" w:sz="4" w:space="0" w:color="D6DCEA"/>
+              <w:right w:val="single" w:sz="4" w:space="0" w:color="D6DCEA"/>
+            </w:tcBorders>
+          </w:tcPr>
+          <w:p>
+            <w:pPr>
+              <w:pStyle w:val="Compact"/>
+              <w:widowControl/>
+              <w:spacing w:before="36" w:after="40"/>
+              <w:jc w:val="left"/>
+              <w:rPr>
+                <w:kern w:val="0"/>
+                <w:szCs w:val="24"/>
+                <w:lang w:val="ru-RU" w:eastAsia="en-US" w:bidi="ar-SA"/>
+              </w:rPr>
+            </w:pPr>
+            <w:r>
+              <w:rPr>
+                <w:kern w:val="0"/>
+                <w:sz w:val="18"/>
+                <w:szCs w:val="24"/>
+                <w:lang w:val="ru-RU" w:eastAsia="en-US" w:bidi="ar-SA"/>
+              </w:rPr>
+              <w:t>—</w:t>
+            </w:r>
+          </w:p>
+        </w:tc>
+        <w:tc>
+          <w:tcPr>
+            <w:tcW w:w="5683" w:type="dxa"/>
+            <w:tcBorders>
+              <w:top w:val="single" w:sz="4" w:space="0" w:color="D6DCEA"/>
+              <w:left w:val="single" w:sz="4" w:space="0" w:color="D6DCEA"/>
+              <w:bottom w:val="single" w:sz="4" w:space="0" w:color="D6DCEA"/>
+              <w:right w:val="single" w:sz="4" w:space="0" w:color="D6DCEA"/>
+            </w:tcBorders>
+          </w:tcPr>
+          <w:p>
+            <w:pPr>
+              <w:pStyle w:val="Compact"/>
+              <w:widowControl/>
+              <w:spacing w:before="36" w:after="40"/>
+              <w:jc w:val="left"/>
+              <w:rPr>
+                <w:kern w:val="0"/>
+                <w:szCs w:val="24"/>
+                <w:lang w:val="ru-RU" w:eastAsia="en-US" w:bidi="ar-SA"/>
+              </w:rPr>
+            </w:pPr>
+            <w:r>
+              <w:rPr>
+                <w:kern w:val="0"/>
+                <w:sz w:val="18"/>
+                <w:szCs w:val="24"/>
+                <w:lang w:val="ru-RU" w:eastAsia="en-US" w:bidi="ar-SA"/>
+              </w:rPr>
+              <w:t xml:space="preserve">Разрешённые адреса Jira через запятую: </w:t>
+            </w:r>
+            <w:r>
+              <w:rPr>
+                <w:rStyle w:val="VerbatimChar"/>
+                <w:kern w:val="0"/>
+                <w:sz w:val="18"/>
+                <w:szCs w:val="24"/>
+                <w:lang w:val="ru-RU" w:eastAsia="en-US" w:bidi="ar-SA"/>
+              </w:rPr>
+              <w:t>jira.company.ru</w:t>
+            </w:r>
+            <w:r>
+              <w:rPr>
+                <w:kern w:val="0"/>
+                <w:sz w:val="18"/>
+                <w:szCs w:val="24"/>
+                <w:lang w:val="ru-RU" w:eastAsia="en-US" w:bidi="ar-SA"/>
+              </w:rPr>
+              <w:t xml:space="preserve"> или </w:t>
+            </w:r>
+            <w:r>
+              <w:rPr>
+                <w:rStyle w:val="VerbatimChar"/>
+                <w:kern w:val="0"/>
+                <w:sz w:val="18"/>
+                <w:szCs w:val="24"/>
+                <w:lang w:val="ru-RU" w:eastAsia="en-US" w:bidi="ar-SA"/>
+              </w:rPr>
+              <w:t>.company.ru</w:t>
+            </w:r>
+            <w:r>
+              <w:rPr>
+                <w:kern w:val="0"/>
+                <w:sz w:val="18"/>
+                <w:szCs w:val="24"/>
+                <w:lang w:val="ru-RU" w:eastAsia="en-US" w:bidi="ar-SA"/>
+              </w:rPr>
+              <w:t xml:space="preserve"> (домен и поддомены); пусто — любой</w:t>
+            </w:r>
+          </w:p>
+        </w:tc>
+      </w:tr>
+      <w:tr>
+        <w:trPr/>
+        <w:tc>
+          <w:tcPr>
+            <w:tcW w:w="2451" w:type="dxa"/>
+            <w:tcBorders>
+              <w:top w:val="single" w:sz="4" w:space="0" w:color="D6DCEA"/>
+              <w:left w:val="single" w:sz="4" w:space="0" w:color="D6DCEA"/>
+              <w:bottom w:val="single" w:sz="4" w:space="0" w:color="D6DCEA"/>
+              <w:right w:val="single" w:sz="4" w:space="0" w:color="D6DCEA"/>
+            </w:tcBorders>
+          </w:tcPr>
+          <w:p>
+            <w:pPr>
+              <w:pStyle w:val="Compact"/>
+              <w:widowControl/>
+              <w:spacing w:before="36" w:after="40"/>
+              <w:jc w:val="left"/>
+              <w:rPr>
+                <w:kern w:val="0"/>
+                <w:szCs w:val="24"/>
+                <w:lang w:val="ru-RU" w:eastAsia="en-US" w:bidi="ar-SA"/>
+              </w:rPr>
+            </w:pPr>
+            <w:r>
+              <w:rPr>
+                <w:rStyle w:val="VerbatimChar"/>
+                <w:kern w:val="0"/>
+                <w:sz w:val="18"/>
+                <w:szCs w:val="24"/>
+                <w:lang w:val="ru-RU" w:eastAsia="en-US" w:bidi="ar-SA"/>
+              </w:rPr>
+              <w:t>JIRA_CACHE_SECONDS</w:t>
+            </w:r>
+          </w:p>
+        </w:tc>
+        <w:tc>
+          <w:tcPr>
+            <w:tcW w:w="1226" w:type="dxa"/>
+            <w:tcBorders>
+              <w:top w:val="single" w:sz="4" w:space="0" w:color="D6DCEA"/>
+              <w:left w:val="single" w:sz="4" w:space="0" w:color="D6DCEA"/>
+              <w:bottom w:val="single" w:sz="4" w:space="0" w:color="D6DCEA"/>
+              <w:right w:val="single" w:sz="4" w:space="0" w:color="D6DCEA"/>
+            </w:tcBorders>
+          </w:tcPr>
+          <w:p>
+            <w:pPr>
+              <w:pStyle w:val="Compact"/>
+              <w:widowControl/>
+              <w:spacing w:before="36" w:after="40"/>
+              <w:jc w:val="left"/>
+              <w:rPr>
+                <w:kern w:val="0"/>
+                <w:szCs w:val="24"/>
+                <w:lang w:val="ru-RU" w:eastAsia="en-US" w:bidi="ar-SA"/>
+              </w:rPr>
+            </w:pPr>
+            <w:r>
+              <w:rPr>
+                <w:rStyle w:val="VerbatimChar"/>
+                <w:kern w:val="0"/>
+                <w:sz w:val="18"/>
+                <w:szCs w:val="24"/>
+                <w:lang w:val="ru-RU" w:eastAsia="en-US" w:bidi="ar-SA"/>
+              </w:rPr>
+              <w:t>300</w:t>
+            </w:r>
+          </w:p>
+        </w:tc>
+        <w:tc>
+          <w:tcPr>
+            <w:tcW w:w="5683" w:type="dxa"/>
+            <w:tcBorders>
+              <w:top w:val="single" w:sz="4" w:space="0" w:color="D6DCEA"/>
+              <w:left w:val="single" w:sz="4" w:space="0" w:color="D6DCEA"/>
+              <w:bottom w:val="single" w:sz="4" w:space="0" w:color="D6DCEA"/>
+              <w:right w:val="single" w:sz="4" w:space="0" w:color="D6DCEA"/>
+            </w:tcBorders>
+          </w:tcPr>
+          <w:p>
+            <w:pPr>
+              <w:pStyle w:val="Compact"/>
+              <w:widowControl/>
+              <w:spacing w:before="36" w:after="40"/>
+              <w:jc w:val="left"/>
+              <w:rPr>
+                <w:kern w:val="0"/>
+                <w:szCs w:val="24"/>
+                <w:lang w:val="ru-RU" w:eastAsia="en-US" w:bidi="ar-SA"/>
+              </w:rPr>
+            </w:pPr>
+            <w:r>
+              <w:rPr>
+                <w:kern w:val="0"/>
+                <w:sz w:val="18"/>
+                <w:szCs w:val="24"/>
+                <w:lang w:val="ru-RU" w:eastAsia="en-US" w:bidi="ar-SA"/>
+              </w:rPr>
+              <w:t>Сколько секунд данные задач Jira считаются свежими при открытии плана</w:t>
+            </w:r>
+          </w:p>
+        </w:tc>
+      </w:tr>
+      <w:tr>
+        <w:trPr/>
+        <w:tc>
+          <w:tcPr>
+            <w:tcW w:w="2451" w:type="dxa"/>
+            <w:tcBorders>
+              <w:top w:val="single" w:sz="4" w:space="0" w:color="D6DCEA"/>
+              <w:left w:val="single" w:sz="4" w:space="0" w:color="D6DCEA"/>
+              <w:bottom w:val="single" w:sz="4" w:space="0" w:color="D6DCEA"/>
+              <w:right w:val="single" w:sz="4" w:space="0" w:color="D6DCEA"/>
+            </w:tcBorders>
+          </w:tcPr>
+          <w:p>
+            <w:pPr>
+              <w:pStyle w:val="Compact"/>
+              <w:widowControl/>
+              <w:spacing w:before="36" w:after="40"/>
+              <w:jc w:val="left"/>
+              <w:rPr>
+                <w:kern w:val="0"/>
+                <w:szCs w:val="24"/>
+                <w:lang w:val="ru-RU" w:eastAsia="en-US" w:bidi="ar-SA"/>
+              </w:rPr>
+            </w:pPr>
+            <w:r>
+              <w:rPr>
+                <w:rStyle w:val="VerbatimChar"/>
+                <w:kern w:val="0"/>
+                <w:sz w:val="18"/>
+                <w:szCs w:val="24"/>
+                <w:lang w:val="ru-RU" w:eastAsia="en-US" w:bidi="ar-SA"/>
+              </w:rPr>
+              <w:t>HTTPS_PROXY</w:t>
+            </w:r>
+            <w:r>
+              <w:rPr>
+                <w:kern w:val="0"/>
+                <w:sz w:val="18"/>
+                <w:szCs w:val="24"/>
+                <w:lang w:val="ru-RU" w:eastAsia="en-US" w:bidi="ar-SA"/>
+              </w:rPr>
+              <w:t xml:space="preserve">, </w:t>
+            </w:r>
+            <w:r>
+              <w:rPr>
+                <w:rStyle w:val="VerbatimChar"/>
+                <w:kern w:val="0"/>
+                <w:sz w:val="18"/>
+                <w:szCs w:val="24"/>
+                <w:lang w:val="ru-RU" w:eastAsia="en-US" w:bidi="ar-SA"/>
+              </w:rPr>
+              <w:t>HTTP_PROXY</w:t>
+            </w:r>
+            <w:r>
+              <w:rPr>
+                <w:kern w:val="0"/>
+                <w:sz w:val="18"/>
+                <w:szCs w:val="24"/>
+                <w:lang w:val="ru-RU" w:eastAsia="en-US" w:bidi="ar-SA"/>
+              </w:rPr>
+              <w:t xml:space="preserve">, </w:t>
+            </w:r>
+            <w:r>
+              <w:rPr>
+                <w:rStyle w:val="VerbatimChar"/>
+                <w:kern w:val="0"/>
+                <w:sz w:val="18"/>
+                <w:szCs w:val="24"/>
+                <w:lang w:val="ru-RU" w:eastAsia="en-US" w:bidi="ar-SA"/>
+              </w:rPr>
+              <w:t>NO_PROXY</w:t>
+            </w:r>
+          </w:p>
+        </w:tc>
+        <w:tc>
+          <w:tcPr>
+            <w:tcW w:w="1226" w:type="dxa"/>
+            <w:tcBorders>
+              <w:top w:val="single" w:sz="4" w:space="0" w:color="D6DCEA"/>
+              <w:left w:val="single" w:sz="4" w:space="0" w:color="D6DCEA"/>
+              <w:bottom w:val="single" w:sz="4" w:space="0" w:color="D6DCEA"/>
+              <w:right w:val="single" w:sz="4" w:space="0" w:color="D6DCEA"/>
+            </w:tcBorders>
+          </w:tcPr>
+          <w:p>
+            <w:pPr>
+              <w:pStyle w:val="Compact"/>
+              <w:widowControl/>
+              <w:spacing w:before="36" w:after="40"/>
+              <w:jc w:val="left"/>
+              <w:rPr>
+                <w:kern w:val="0"/>
+                <w:szCs w:val="24"/>
+                <w:lang w:val="ru-RU" w:eastAsia="en-US" w:bidi="ar-SA"/>
+              </w:rPr>
+            </w:pPr>
+            <w:r>
+              <w:rPr>
+                <w:kern w:val="0"/>
+                <w:sz w:val="18"/>
+                <w:szCs w:val="24"/>
+                <w:lang w:val="ru-RU" w:eastAsia="en-US" w:bidi="ar-SA"/>
+              </w:rPr>
+              <w:t>—</w:t>
+            </w:r>
+          </w:p>
+        </w:tc>
+        <w:tc>
+          <w:tcPr>
+            <w:tcW w:w="5683" w:type="dxa"/>
+            <w:tcBorders>
+              <w:top w:val="single" w:sz="4" w:space="0" w:color="D6DCEA"/>
+              <w:left w:val="single" w:sz="4" w:space="0" w:color="D6DCEA"/>
+              <w:bottom w:val="single" w:sz="4" w:space="0" w:color="D6DCEA"/>
+              <w:right w:val="single" w:sz="4" w:space="0" w:color="D6DCEA"/>
+            </w:tcBorders>
+          </w:tcPr>
+          <w:p>
+            <w:pPr>
+              <w:pStyle w:val="Compact"/>
+              <w:widowControl/>
+              <w:spacing w:before="36" w:after="40"/>
+              <w:jc w:val="left"/>
+              <w:rPr>
+                <w:kern w:val="0"/>
+                <w:szCs w:val="24"/>
+                <w:lang w:val="ru-RU" w:eastAsia="en-US" w:bidi="ar-SA"/>
+              </w:rPr>
+            </w:pPr>
+            <w:r>
+              <w:rPr>
+                <w:kern w:val="0"/>
+                <w:sz w:val="18"/>
+                <w:szCs w:val="24"/>
+                <w:lang w:val="ru-RU" w:eastAsia="en-US" w:bidi="ar-SA"/>
+              </w:rPr>
+              <w:t>Прокси для выхода backend к Jira, если сервер ходит в сеть через прокси</w:t>
+            </w:r>
+          </w:p>
+        </w:tc>
+      </w:tr>
+    </w:tbl>
+    <w:p>
+      <w:pPr>
+        <w:pStyle w:val="BodyText"/>
+        <w:rPr/>
+      </w:pPr>
+      <w:r>
+        <w:rPr/>
+        <w:t xml:space="preserve">Само подключение (адрес, учётная запись, токен) задаёт администратор в интерфейсе: «Администрирование → Интеграции». Токен хранится в базе зашифрованным ключом из </w:t>
+      </w:r>
+      <w:r>
+        <w:rPr>
+          <w:rStyle w:val="VerbatimChar"/>
+        </w:rPr>
+        <w:t>SECRET_KEY</w:t>
+      </w:r>
+      <w:r>
+        <w:rPr/>
+        <w:t xml:space="preserve">: после смены </w:t>
+      </w:r>
+      <w:r>
+        <w:rPr>
+          <w:rStyle w:val="VerbatimChar"/>
+        </w:rPr>
+        <w:t>SECRET_KEY</w:t>
+      </w:r>
+      <w:r>
+        <w:rPr/>
+        <w:t xml:space="preserve"> токен нужно ввести заново.</w:t>
+      </w:r>
+    </w:p>
+    <w:p>
+      <w:pPr>
+        <w:pStyle w:val="Heading2"/>
+        <w:rPr/>
+      </w:pPr>
+      <w:bookmarkStart w:id="36" w:name="__RefHeading___Toc1937_34642702"/>
+      <w:bookmarkEnd w:id="36"/>
+      <w:r>
+        <w:rPr>
+          <w:rStyle w:val="SectionNumber"/>
+        </w:rPr>
+        <w:t>6.5</w:t>
       </w:r>
       <w:r>
         <w:rPr/>
@@ -5548,8 +6178,10 @@
               </w:rPr>
               <w:t>Сколько дней хранить ежедневные копии</w:t>
             </w:r>
-            <w:bookmarkStart w:id="36" w:name="переменные-окружения"/>
-            <w:bookmarkEnd w:id="36"/>
+            <w:bookmarkStart w:id="37" w:name="переменные-окружения"/>
+            <w:bookmarkStart w:id="38" w:name="резервное-копирование"/>
+            <w:bookmarkEnd w:id="37"/>
+            <w:bookmarkEnd w:id="38"/>
           </w:p>
         </w:tc>
       </w:tr>
@@ -5559,13 +6191,519 @@
         <w:pStyle w:val="Heading1"/>
         <w:rPr/>
       </w:pPr>
-      <w:bookmarkStart w:id="37" w:name="__RefHeading___Toc1713_1939341289"/>
-      <w:bookmarkEnd w:id="37"/>
+      <w:bookmarkStart w:id="39" w:name="__RefHeading___Toc1939_34642702"/>
+      <w:bookmarkEnd w:id="39"/>
       <w:r>
         <w:rPr>
           <w:rStyle w:val="SectionNumber"/>
         </w:rPr>
         <w:t>7</w:t>
+      </w:r>
+      <w:r>
+        <w:rPr/>
+        <w:tab/>
+        <w:t>Структура компании из командной строки</w:t>
+      </w:r>
+    </w:p>
+    <w:p>
+      <w:pPr>
+        <w:pStyle w:val="FirstParagraph"/>
+        <w:rPr/>
+      </w:pPr>
+      <w:r>
+        <w:rPr/>
+        <w:t xml:space="preserve">Те же операции, что на странице «Импорт и экспорт», — командой в контейнере backend (без </w:t>
+      </w:r>
+      <w:r>
+        <w:rPr>
+          <w:rStyle w:val="VerbatimChar"/>
+        </w:rPr>
+        <w:t>--apply</w:t>
+      </w:r>
+      <w:r>
+        <w:rPr/>
+        <w:t xml:space="preserve"> — только проверка, ничего не записывается):</w:t>
+      </w:r>
+    </w:p>
+    <w:p>
+      <w:pPr>
+        <w:pStyle w:val="SourceCode"/>
+        <w:rPr/>
+      </w:pPr>
+      <w:r>
+        <w:rPr>
+          <w:rStyle w:val="ExtensionTok"/>
+        </w:rPr>
+        <w:t>docker</w:t>
+      </w:r>
+      <w:r>
+        <w:rPr>
+          <w:rStyle w:val="NormalTok"/>
+        </w:rPr>
+        <w:t xml:space="preserve"> compose exec backend python scripts/org_transfer.py export-structure </w:t>
+      </w:r>
+      <w:r>
+        <w:rPr>
+          <w:rStyle w:val="AttributeTok"/>
+        </w:rPr>
+        <w:t>-o</w:t>
+      </w:r>
+      <w:r>
+        <w:rPr>
+          <w:rStyle w:val="NormalTok"/>
+        </w:rPr>
+        <w:t xml:space="preserve"> /tmp/structure.json</w:t>
+      </w:r>
+      <w:r>
+        <w:rPr/>
+        <w:br/>
+      </w:r>
+      <w:r>
+        <w:rPr>
+          <w:rStyle w:val="ExtensionTok"/>
+        </w:rPr>
+        <w:t>docker</w:t>
+      </w:r>
+      <w:r>
+        <w:rPr>
+          <w:rStyle w:val="NormalTok"/>
+        </w:rPr>
+        <w:t xml:space="preserve"> compose exec backend python scripts/org_transfer.py export-employees </w:t>
+      </w:r>
+      <w:r>
+        <w:rPr>
+          <w:rStyle w:val="AttributeTok"/>
+        </w:rPr>
+        <w:t>--format</w:t>
+      </w:r>
+      <w:r>
+        <w:rPr>
+          <w:rStyle w:val="NormalTok"/>
+        </w:rPr>
+        <w:t xml:space="preserve"> zip </w:t>
+      </w:r>
+      <w:r>
+        <w:rPr>
+          <w:rStyle w:val="AttributeTok"/>
+        </w:rPr>
+        <w:t>-o</w:t>
+      </w:r>
+      <w:r>
+        <w:rPr>
+          <w:rStyle w:val="NormalTok"/>
+        </w:rPr>
+        <w:t xml:space="preserve"> /tmp/employees.zip</w:t>
+      </w:r>
+      <w:r>
+        <w:rPr/>
+        <w:br/>
+      </w:r>
+      <w:r>
+        <w:rPr>
+          <w:rStyle w:val="ExtensionTok"/>
+        </w:rPr>
+        <w:t>docker</w:t>
+      </w:r>
+      <w:r>
+        <w:rPr>
+          <w:rStyle w:val="NormalTok"/>
+        </w:rPr>
+        <w:t xml:space="preserve"> compose cp backend:/tmp/structure.json backend:/tmp/employees.zip .</w:t>
+      </w:r>
+    </w:p>
+    <w:p>
+      <w:pPr>
+        <w:pStyle w:val="FirstParagraph"/>
+        <w:rPr/>
+      </w:pPr>
+      <w:r>
+        <w:rPr/>
+        <w:t>Загрузка: скопируйте файл в контейнер и проверьте, затем примените (</w:t>
+      </w:r>
+      <w:r>
+        <w:rPr>
+          <w:rStyle w:val="VerbatimChar"/>
+        </w:rPr>
+        <w:t>--actor</w:t>
+      </w:r>
+      <w:r>
+        <w:rPr/>
+        <w:t xml:space="preserve"> — логин администратора, от имени которого изменения попадут в реестр):</w:t>
+      </w:r>
+    </w:p>
+    <w:p>
+      <w:pPr>
+        <w:pStyle w:val="SourceCode"/>
+        <w:rPr/>
+      </w:pPr>
+      <w:r>
+        <w:rPr>
+          <w:rStyle w:val="ExtensionTok"/>
+        </w:rPr>
+        <w:t>docker</w:t>
+      </w:r>
+      <w:r>
+        <w:rPr>
+          <w:rStyle w:val="NormalTok"/>
+        </w:rPr>
+        <w:t xml:space="preserve"> compose cp people.csv backend:/tmp/people.csv</w:t>
+      </w:r>
+      <w:r>
+        <w:rPr/>
+        <w:br/>
+      </w:r>
+      <w:r>
+        <w:rPr>
+          <w:rStyle w:val="ExtensionTok"/>
+        </w:rPr>
+        <w:t>docker</w:t>
+      </w:r>
+      <w:r>
+        <w:rPr>
+          <w:rStyle w:val="NormalTok"/>
+        </w:rPr>
+        <w:t xml:space="preserve"> compose exec backend python scripts/org_transfer.py import-csv /tmp/people.csv </w:t>
+      </w:r>
+      <w:r>
+        <w:rPr>
+          <w:rStyle w:val="AttributeTok"/>
+        </w:rPr>
+        <w:t>--create-missing</w:t>
+      </w:r>
+      <w:r>
+        <w:rPr>
+          <w:rStyle w:val="NormalTok"/>
+        </w:rPr>
+        <w:t xml:space="preserve"> </w:t>
+      </w:r>
+      <w:r>
+        <w:rPr>
+          <w:rStyle w:val="AttributeTok"/>
+        </w:rPr>
+        <w:t>--actor</w:t>
+      </w:r>
+      <w:r>
+        <w:rPr>
+          <w:rStyle w:val="NormalTok"/>
+        </w:rPr>
+        <w:t xml:space="preserve"> admin</w:t>
+      </w:r>
+      <w:r>
+        <w:rPr/>
+        <w:br/>
+      </w:r>
+      <w:r>
+        <w:rPr>
+          <w:rStyle w:val="ExtensionTok"/>
+        </w:rPr>
+        <w:t>docker</w:t>
+      </w:r>
+      <w:r>
+        <w:rPr>
+          <w:rStyle w:val="NormalTok"/>
+        </w:rPr>
+        <w:t xml:space="preserve"> compose exec backend python scripts/org_transfer.py import-csv /tmp/people.csv </w:t>
+      </w:r>
+      <w:r>
+        <w:rPr>
+          <w:rStyle w:val="AttributeTok"/>
+        </w:rPr>
+        <w:t>--create-missing</w:t>
+      </w:r>
+      <w:r>
+        <w:rPr>
+          <w:rStyle w:val="NormalTok"/>
+        </w:rPr>
+        <w:t xml:space="preserve"> </w:t>
+      </w:r>
+      <w:r>
+        <w:rPr>
+          <w:rStyle w:val="AttributeTok"/>
+        </w:rPr>
+        <w:t>--actor</w:t>
+      </w:r>
+      <w:r>
+        <w:rPr>
+          <w:rStyle w:val="NormalTok"/>
+        </w:rPr>
+        <w:t xml:space="preserve"> admin </w:t>
+      </w:r>
+      <w:r>
+        <w:rPr>
+          <w:rStyle w:val="AttributeTok"/>
+        </w:rPr>
+        <w:t>--apply</w:t>
+      </w:r>
+    </w:p>
+    <w:p>
+      <w:pPr>
+        <w:pStyle w:val="FirstParagraph"/>
+        <w:rPr/>
+      </w:pPr>
+      <w:r>
+        <w:rPr/>
+        <w:t xml:space="preserve">Так же работают </w:t>
+      </w:r>
+      <w:r>
+        <w:rPr>
+          <w:rStyle w:val="VerbatimChar"/>
+        </w:rPr>
+        <w:t>import-structure</w:t>
+      </w:r>
+      <w:r>
+        <w:rPr/>
+        <w:t xml:space="preserve"> (</w:t>
+      </w:r>
+      <w:r>
+        <w:rPr>
+          <w:rStyle w:val="VerbatimChar"/>
+        </w:rPr>
+        <w:t>--no-settings</w:t>
+      </w:r>
+      <w:r>
+        <w:rPr/>
+        <w:t xml:space="preserve"> — без типов и глубины из файла), </w:t>
+      </w:r>
+      <w:r>
+        <w:rPr>
+          <w:rStyle w:val="VerbatimChar"/>
+        </w:rPr>
+        <w:t>import-employees</w:t>
+      </w:r>
+      <w:r>
+        <w:rPr/>
+        <w:t xml:space="preserve"> (</w:t>
+      </w:r>
+      <w:r>
+        <w:rPr>
+          <w:rStyle w:val="VerbatimChar"/>
+        </w:rPr>
+        <w:t>--new-users active|inactive|file</w:t>
+      </w:r>
+      <w:r>
+        <w:rPr/>
+        <w:t xml:space="preserve">) и </w:t>
+      </w:r>
+      <w:r>
+        <w:rPr>
+          <w:rStyle w:val="VerbatimChar"/>
+        </w:rPr>
+        <w:t>sync-ad</w:t>
+      </w:r>
+      <w:r>
+        <w:rPr/>
+        <w:t xml:space="preserve"> (</w:t>
+      </w:r>
+      <w:r>
+        <w:rPr>
+          <w:rStyle w:val="VerbatimChar"/>
+        </w:rPr>
+        <w:t>--create-missing</w:t>
+      </w:r>
+      <w:r>
+        <w:rPr/>
+        <w:t xml:space="preserve">, </w:t>
+      </w:r>
+      <w:r>
+        <w:rPr>
+          <w:rStyle w:val="VerbatimChar"/>
+        </w:rPr>
+        <w:t>--deactivate-missing</w:t>
+      </w:r>
+      <w:r>
+        <w:rPr/>
+        <w:t>).</w:t>
+      </w:r>
+    </w:p>
+    <w:p>
+      <w:pPr>
+        <w:pStyle w:val="BodyText"/>
+        <w:rPr/>
+      </w:pPr>
+      <w:r>
+        <w:rPr/>
+        <w:t>Синхронизация с Active Directory по расписанию — запись cron на сервере, например ежедневно в 06:15:</w:t>
+      </w:r>
+    </w:p>
+    <w:p>
+      <w:pPr>
+        <w:pStyle w:val="SourceCode"/>
+        <w:rPr/>
+      </w:pPr>
+      <w:r>
+        <w:rPr>
+          <w:rStyle w:val="ExtensionTok"/>
+        </w:rPr>
+        <w:t>15</w:t>
+      </w:r>
+      <w:r>
+        <w:rPr>
+          <w:rStyle w:val="NormalTok"/>
+        </w:rPr>
+        <w:t xml:space="preserve"> 6 </w:t>
+      </w:r>
+      <w:r>
+        <w:rPr>
+          <w:rStyle w:val="PreprocessorTok"/>
+        </w:rPr>
+        <w:t>*</w:t>
+      </w:r>
+      <w:r>
+        <w:rPr>
+          <w:rStyle w:val="NormalTok"/>
+        </w:rPr>
+        <w:t xml:space="preserve"> </w:t>
+      </w:r>
+      <w:r>
+        <w:rPr>
+          <w:rStyle w:val="PreprocessorTok"/>
+        </w:rPr>
+        <w:t>*</w:t>
+      </w:r>
+      <w:r>
+        <w:rPr>
+          <w:rStyle w:val="NormalTok"/>
+        </w:rPr>
+        <w:t xml:space="preserve"> </w:t>
+      </w:r>
+      <w:r>
+        <w:rPr>
+          <w:rStyle w:val="PreprocessorTok"/>
+        </w:rPr>
+        <w:t>*</w:t>
+      </w:r>
+      <w:r>
+        <w:rPr>
+          <w:rStyle w:val="NormalTok"/>
+        </w:rPr>
+        <w:t xml:space="preserve"> cd /opt/puls </w:t>
+      </w:r>
+      <w:r>
+        <w:rPr>
+          <w:rStyle w:val="KeywordTok"/>
+        </w:rPr>
+        <w:t>&amp;&amp;</w:t>
+      </w:r>
+      <w:r>
+        <w:rPr>
+          <w:rStyle w:val="NormalTok"/>
+        </w:rPr>
+        <w:t xml:space="preserve"> </w:t>
+      </w:r>
+      <w:r>
+        <w:rPr>
+          <w:rStyle w:val="ExtensionTok"/>
+        </w:rPr>
+        <w:t>docker</w:t>
+      </w:r>
+      <w:r>
+        <w:rPr>
+          <w:rStyle w:val="NormalTok"/>
+        </w:rPr>
+        <w:t xml:space="preserve"> compose exec </w:t>
+      </w:r>
+      <w:r>
+        <w:rPr>
+          <w:rStyle w:val="AttributeTok"/>
+        </w:rPr>
+        <w:t>-T</w:t>
+      </w:r>
+      <w:r>
+        <w:rPr>
+          <w:rStyle w:val="NormalTok"/>
+        </w:rPr>
+        <w:t xml:space="preserve"> backend python scripts/org_transfer.py sync-ad </w:t>
+      </w:r>
+      <w:r>
+        <w:rPr>
+          <w:rStyle w:val="AttributeTok"/>
+        </w:rPr>
+        <w:t>--create-missing</w:t>
+      </w:r>
+      <w:r>
+        <w:rPr>
+          <w:rStyle w:val="NormalTok"/>
+        </w:rPr>
+        <w:t xml:space="preserve"> </w:t>
+      </w:r>
+      <w:r>
+        <w:rPr>
+          <w:rStyle w:val="AttributeTok"/>
+        </w:rPr>
+        <w:t>--actor</w:t>
+      </w:r>
+      <w:r>
+        <w:rPr>
+          <w:rStyle w:val="NormalTok"/>
+        </w:rPr>
+        <w:t xml:space="preserve"> admin </w:t>
+      </w:r>
+      <w:r>
+        <w:rPr>
+          <w:rStyle w:val="AttributeTok"/>
+        </w:rPr>
+        <w:t>--apply</w:t>
+      </w:r>
+      <w:r>
+        <w:rPr>
+          <w:rStyle w:val="NormalTok"/>
+        </w:rPr>
+        <w:t xml:space="preserve"> </w:t>
+      </w:r>
+      <w:r>
+        <w:rPr>
+          <w:rStyle w:val="OperatorTok"/>
+        </w:rPr>
+        <w:t>&gt;&gt;</w:t>
+      </w:r>
+      <w:r>
+        <w:rPr>
+          <w:rStyle w:val="NormalTok"/>
+        </w:rPr>
+        <w:t xml:space="preserve"> /var/log/puls-ad-sync.log </w:t>
+      </w:r>
+      <w:r>
+        <w:rPr>
+          <w:rStyle w:val="DecValTok"/>
+        </w:rPr>
+        <w:t>2</w:t>
+      </w:r>
+      <w:r>
+        <w:rPr>
+          <w:rStyle w:val="OperatorTok"/>
+        </w:rPr>
+        <w:t>&gt;&amp;</w:t>
+      </w:r>
+      <w:r>
+        <w:rPr>
+          <w:rStyle w:val="DecValTok"/>
+        </w:rPr>
+        <w:t>1</w:t>
+      </w:r>
+    </w:p>
+    <w:p>
+      <w:pPr>
+        <w:pStyle w:val="FirstParagraph"/>
+        <w:rPr/>
+      </w:pPr>
+      <w:r>
+        <w:rPr/>
+        <w:t>Подключение к каталогу берётся из «Администрирование → Настройки → Вход через домен», параметры синхронизации — со страницы «Импорт и экспорт → Active Directory».</w:t>
+      </w:r>
+    </w:p>
+    <w:p>
+      <w:pPr>
+        <w:pStyle w:val="Heading1"/>
+        <w:rPr/>
+      </w:pPr>
+      <w:bookmarkStart w:id="40" w:name="__RefHeading___Toc1941_34642702"/>
+      <w:bookmarkStart w:id="41" w:name="резервное-копирование-и-восстановление"/>
+      <w:bookmarkEnd w:id="40"/>
+      <w:r>
+        <w:rPr>
+          <w:rStyle w:val="SectionNumber"/>
+        </w:rPr>
+        <w:t>8</w:t>
       </w:r>
       <w:r>
         <w:rPr/>
@@ -5578,14 +6716,14 @@
         <w:pStyle w:val="Heading2"/>
         <w:rPr/>
       </w:pPr>
-      <w:bookmarkStart w:id="38" w:name="__RefHeading___Toc1715_1939341289"/>
-      <w:bookmarkStart w:id="39" w:name="копии"/>
-      <w:bookmarkEnd w:id="38"/>
+      <w:bookmarkStart w:id="42" w:name="__RefHeading___Toc1943_34642702"/>
+      <w:bookmarkStart w:id="43" w:name="копии"/>
+      <w:bookmarkEnd w:id="42"/>
       <w:r>
         <w:rPr>
           <w:rStyle w:val="SectionNumber"/>
         </w:rPr>
-        <w:t>7.1</w:t>
+        <w:t>8.1</w:t>
       </w:r>
       <w:r>
         <w:rPr/>
@@ -5798,21 +6936,21 @@
         <w:rPr/>
         <w:t>.</w:t>
       </w:r>
-      <w:bookmarkEnd w:id="39"/>
+      <w:bookmarkEnd w:id="43"/>
     </w:p>
     <w:p>
       <w:pPr>
         <w:pStyle w:val="Heading2"/>
         <w:rPr/>
       </w:pPr>
-      <w:bookmarkStart w:id="40" w:name="__RefHeading___Toc1717_1939341289"/>
-      <w:bookmarkStart w:id="41" w:name="восстановление"/>
-      <w:bookmarkEnd w:id="40"/>
+      <w:bookmarkStart w:id="44" w:name="__RefHeading___Toc1945_34642702"/>
+      <w:bookmarkStart w:id="45" w:name="восстановление"/>
+      <w:bookmarkEnd w:id="44"/>
       <w:r>
         <w:rPr>
           <w:rStyle w:val="SectionNumber"/>
         </w:rPr>
-        <w:t>7.2</w:t>
+        <w:t>8.2</w:t>
       </w:r>
       <w:r>
         <w:rPr/>
@@ -5924,20 +7062,21 @@
         <w:t xml:space="preserve"> Раз в квартал восстанавливайте последнюю копию на тестовом сервере — это единственная проверка, что копии пригодны.</w:t>
       </w:r>
       <w:bookmarkEnd w:id="41"/>
+      <w:bookmarkEnd w:id="45"/>
     </w:p>
     <w:p>
       <w:pPr>
         <w:pStyle w:val="Heading1"/>
         <w:rPr/>
       </w:pPr>
-      <w:bookmarkStart w:id="42" w:name="__RefHeading___Toc1719_1939341289"/>
-      <w:bookmarkStart w:id="43" w:name="обновление"/>
-      <w:bookmarkEnd w:id="42"/>
+      <w:bookmarkStart w:id="46" w:name="__RefHeading___Toc1947_34642702"/>
+      <w:bookmarkStart w:id="47" w:name="обновление"/>
+      <w:bookmarkEnd w:id="46"/>
       <w:r>
         <w:rPr>
           <w:rStyle w:val="SectionNumber"/>
         </w:rPr>
-        <w:t>8</w:t>
+        <w:t>9</w:t>
       </w:r>
       <w:r>
         <w:rPr/>
@@ -5950,14 +7089,14 @@
         <w:pStyle w:val="Heading2"/>
         <w:rPr/>
       </w:pPr>
-      <w:bookmarkStart w:id="44" w:name="__RefHeading___Toc1721_1939341289"/>
-      <w:bookmarkStart w:id="45" w:name="обычный-порядок"/>
-      <w:bookmarkEnd w:id="44"/>
+      <w:bookmarkStart w:id="48" w:name="__RefHeading___Toc1949_34642702"/>
+      <w:bookmarkStart w:id="49" w:name="обычный-порядок"/>
+      <w:bookmarkEnd w:id="48"/>
       <w:r>
         <w:rPr>
           <w:rStyle w:val="SectionNumber"/>
         </w:rPr>
-        <w:t>8.1</w:t>
+        <w:t>9.1</w:t>
       </w:r>
       <w:r>
         <w:rPr/>
@@ -6034,7 +7173,7 @@
         <w:rPr>
           <w:rStyle w:val="NormalTok"/>
         </w:rPr>
-        <w:t xml:space="preserve"> sh deploy/update.sh v0.2.1</w:t>
+        <w:t xml:space="preserve"> sh deploy/update.sh v0.3.0</w:t>
       </w:r>
     </w:p>
     <w:p>
@@ -6090,21 +7229,21 @@
         <w:rPr/>
         <w:t xml:space="preserve"> (версия), вход, открытие крупного проекта.</w:t>
       </w:r>
-      <w:bookmarkEnd w:id="45"/>
+      <w:bookmarkEnd w:id="49"/>
     </w:p>
     <w:p>
       <w:pPr>
         <w:pStyle w:val="Heading2"/>
         <w:rPr/>
       </w:pPr>
-      <w:bookmarkStart w:id="46" w:name="__RefHeading___Toc1723_1939341289"/>
-      <w:bookmarkStart w:id="47" w:name="откат"/>
-      <w:bookmarkEnd w:id="46"/>
+      <w:bookmarkStart w:id="50" w:name="__RefHeading___Toc1951_34642702"/>
+      <w:bookmarkStart w:id="51" w:name="откат"/>
+      <w:bookmarkEnd w:id="50"/>
       <w:r>
         <w:rPr>
           <w:rStyle w:val="SectionNumber"/>
         </w:rPr>
-        <w:t>8.2</w:t>
+        <w:t>9.2</w:t>
       </w:r>
       <w:r>
         <w:rPr/>
@@ -6307,22 +7446,22 @@
         <w:rPr/>
         <w:t>.</w:t>
       </w:r>
-      <w:bookmarkEnd w:id="43"/>
       <w:bookmarkEnd w:id="47"/>
+      <w:bookmarkEnd w:id="51"/>
     </w:p>
     <w:p>
       <w:pPr>
         <w:pStyle w:val="Heading1"/>
         <w:rPr/>
       </w:pPr>
-      <w:bookmarkStart w:id="48" w:name="__RefHeading___Toc1725_1939341289"/>
-      <w:bookmarkStart w:id="49" w:name="наблюдение-и-журналы"/>
-      <w:bookmarkEnd w:id="48"/>
+      <w:bookmarkStart w:id="52" w:name="__RefHeading___Toc1953_34642702"/>
+      <w:bookmarkStart w:id="53" w:name="наблюдение-и-журналы"/>
+      <w:bookmarkEnd w:id="52"/>
       <w:r>
         <w:rPr>
           <w:rStyle w:val="SectionNumber"/>
         </w:rPr>
-        <w:t>9</w:t>
+        <w:t>10</w:t>
       </w:r>
       <w:r>
         <w:rPr/>
@@ -6335,14 +7474,14 @@
         <w:pStyle w:val="Heading2"/>
         <w:rPr/>
       </w:pPr>
-      <w:bookmarkStart w:id="50" w:name="__RefHeading___Toc1727_1939341289"/>
-      <w:bookmarkStart w:id="51" w:name="проверки"/>
-      <w:bookmarkEnd w:id="50"/>
+      <w:bookmarkStart w:id="54" w:name="__RefHeading___Toc1955_34642702"/>
+      <w:bookmarkStart w:id="55" w:name="проверки"/>
+      <w:bookmarkEnd w:id="54"/>
       <w:r>
         <w:rPr>
           <w:rStyle w:val="SectionNumber"/>
         </w:rPr>
-        <w:t>9.1</w:t>
+        <w:t>10.1</w:t>
       </w:r>
       <w:r>
         <w:rPr/>
@@ -6696,21 +7835,21 @@
         <w:rPr/>
         <w:t>).</w:t>
       </w:r>
-      <w:bookmarkEnd w:id="51"/>
+      <w:bookmarkEnd w:id="55"/>
     </w:p>
     <w:p>
       <w:pPr>
         <w:pStyle w:val="Heading2"/>
         <w:rPr/>
       </w:pPr>
-      <w:bookmarkStart w:id="52" w:name="__RefHeading___Toc1729_1939341289"/>
-      <w:bookmarkStart w:id="53" w:name="журналы"/>
-      <w:bookmarkEnd w:id="52"/>
+      <w:bookmarkStart w:id="56" w:name="__RefHeading___Toc1957_34642702"/>
+      <w:bookmarkStart w:id="57" w:name="журналы"/>
+      <w:bookmarkEnd w:id="56"/>
       <w:r>
         <w:rPr>
           <w:rStyle w:val="SectionNumber"/>
         </w:rPr>
-        <w:t>9.2</w:t>
+        <w:t>10.2</w:t>
       </w:r>
       <w:r>
         <w:rPr/>
@@ -6849,22 +7988,22 @@
         <w:rPr/>
         <w:t>.</w:t>
       </w:r>
-      <w:bookmarkEnd w:id="49"/>
       <w:bookmarkEnd w:id="53"/>
+      <w:bookmarkEnd w:id="57"/>
     </w:p>
     <w:p>
       <w:pPr>
         <w:pStyle w:val="Heading1"/>
         <w:rPr/>
       </w:pPr>
-      <w:bookmarkStart w:id="54" w:name="__RefHeading___Toc1731_1939341289"/>
-      <w:bookmarkStart w:id="55" w:name="безопасность"/>
-      <w:bookmarkEnd w:id="54"/>
+      <w:bookmarkStart w:id="58" w:name="__RefHeading___Toc1959_34642702"/>
+      <w:bookmarkStart w:id="59" w:name="безопасность"/>
+      <w:bookmarkEnd w:id="58"/>
       <w:r>
         <w:rPr>
           <w:rStyle w:val="SectionNumber"/>
         </w:rPr>
-        <w:t>10</w:t>
+        <w:t>11</w:t>
       </w:r>
       <w:r>
         <w:rPr/>
@@ -6977,26 +8116,26 @@
         </w:numPr>
         <w:rPr/>
       </w:pPr>
-      <w:bookmarkStart w:id="56" w:name="безопасность"/>
+      <w:bookmarkStart w:id="60" w:name="безопасность"/>
       <w:r>
         <w:rPr/>
         <w:t>Сессии хранятся в базе в виде хэшей; отключение сотрудника завершает его сессии сразу.</w:t>
       </w:r>
-      <w:bookmarkEnd w:id="56"/>
+      <w:bookmarkEnd w:id="60"/>
     </w:p>
     <w:p>
       <w:pPr>
         <w:pStyle w:val="Heading1"/>
         <w:rPr/>
       </w:pPr>
-      <w:bookmarkStart w:id="57" w:name="__RefHeading___Toc1733_1939341289"/>
-      <w:bookmarkStart w:id="58" w:name="масштабирование"/>
-      <w:bookmarkEnd w:id="57"/>
+      <w:bookmarkStart w:id="61" w:name="__RefHeading___Toc1961_34642702"/>
+      <w:bookmarkStart w:id="62" w:name="масштабирование"/>
+      <w:bookmarkEnd w:id="61"/>
       <w:r>
         <w:rPr>
           <w:rStyle w:val="SectionNumber"/>
         </w:rPr>
-        <w:t>11</w:t>
+        <w:t>12</w:t>
       </w:r>
       <w:r>
         <w:rPr/>
@@ -7075,21 +8214,21 @@
         <w:rPr/>
         <w:t xml:space="preserve"> на учётную запись. Общий строгий предел потребует Redis — он не входит в поставку.</w:t>
       </w:r>
-      <w:bookmarkEnd w:id="58"/>
+      <w:bookmarkEnd w:id="62"/>
     </w:p>
     <w:p>
       <w:pPr>
         <w:pStyle w:val="Heading1"/>
         <w:rPr/>
       </w:pPr>
-      <w:bookmarkStart w:id="59" w:name="__RefHeading___Toc1735_1939341289"/>
-      <w:bookmarkStart w:id="60" w:name="установка-в-закрытом-контуре"/>
-      <w:bookmarkEnd w:id="59"/>
+      <w:bookmarkStart w:id="63" w:name="__RefHeading___Toc1963_34642702"/>
+      <w:bookmarkStart w:id="64" w:name="установка-в-закрытом-контуре"/>
+      <w:bookmarkEnd w:id="63"/>
       <w:r>
         <w:rPr>
           <w:rStyle w:val="SectionNumber"/>
         </w:rPr>
-        <w:t>12</w:t>
+        <w:t>13</w:t>
       </w:r>
       <w:r>
         <w:rPr/>
@@ -7206,7 +8345,7 @@
         <w:rPr>
           <w:rStyle w:val="NormalTok"/>
         </w:rPr>
-        <w:t xml:space="preserve"> puls-0.2.1-images.tar.gz</w:t>
+        <w:t xml:space="preserve"> puls-0.3.0-images.tar.gz</w:t>
       </w:r>
     </w:p>
     <w:p>
@@ -7246,7 +8385,7 @@
         <w:rPr>
           <w:rStyle w:val="NormalTok"/>
         </w:rPr>
-        <w:t xml:space="preserve"> puls-0.2.1-images.tar.gz </w:t>
+        <w:t xml:space="preserve"> puls-0.3.0-images.tar.gz </w:t>
       </w:r>
       <w:r>
         <w:rPr>
@@ -7352,20 +8491,20 @@
         <w:rPr/>
         <w:t>).</w:t>
       </w:r>
-      <w:bookmarkEnd w:id="60"/>
+      <w:bookmarkEnd w:id="64"/>
     </w:p>
     <w:p>
       <w:pPr>
         <w:pStyle w:val="Heading1"/>
         <w:rPr/>
       </w:pPr>
-      <w:bookmarkStart w:id="61" w:name="__RefHeading___Toc1737_1939341289"/>
-      <w:bookmarkEnd w:id="61"/>
+      <w:bookmarkStart w:id="65" w:name="__RefHeading___Toc1965_34642702"/>
+      <w:bookmarkEnd w:id="65"/>
       <w:r>
         <w:rPr>
           <w:rStyle w:val="SectionNumber"/>
         </w:rPr>
-        <w:t>13</w:t>
+        <w:t>14</w:t>
       </w:r>
       <w:r>
         <w:rPr/>
@@ -8272,8 +9411,8 @@
               </w:rPr>
               <w:t>docker image prune</w:t>
             </w:r>
-            <w:bookmarkStart w:id="62" w:name="диагностика"/>
-            <w:bookmarkEnd w:id="62"/>
+            <w:bookmarkStart w:id="66" w:name="диагностика"/>
+            <w:bookmarkEnd w:id="66"/>
           </w:p>
         </w:tc>
       </w:tr>
@@ -8283,13 +9422,13 @@
         <w:pStyle w:val="Heading1"/>
         <w:rPr/>
       </w:pPr>
-      <w:bookmarkStart w:id="63" w:name="__RefHeading___Toc1739_1939341289"/>
-      <w:bookmarkEnd w:id="63"/>
+      <w:bookmarkStart w:id="67" w:name="__RefHeading___Toc1967_34642702"/>
+      <w:bookmarkEnd w:id="67"/>
       <w:r>
         <w:rPr>
           <w:rStyle w:val="SectionNumber"/>
         </w:rPr>
-        <w:t>14</w:t>
+        <w:t>15</w:t>
       </w:r>
       <w:r>
         <w:rPr/>
@@ -8804,7 +9943,7 @@
         <w:color w:val="8A92A6"/>
         <w:sz w:val="16"/>
       </w:rPr>
-      <w:t xml:space="preserve">Пульс Проекта 0.2.1 · стр. </w:t>
+      <w:t xml:space="preserve">Пульс Проекта 0.3.0 · стр. </w:t>
     </w:r>
     <w:r>
       <w:rPr/>
@@ -8820,7 +9959,7 @@
     </w:r>
     <w:r>
       <w:rPr/>
-      <w:t>18</w:t>
+      <w:t>20</w:t>
     </w:r>
     <w:r>
       <w:rPr/>
@@ -8843,7 +9982,7 @@
         <w:color w:val="8A92A6"/>
         <w:sz w:val="16"/>
       </w:rPr>
-      <w:t xml:space="preserve">Пульс Проекта 0.2.1 · стр. </w:t>
+      <w:t xml:space="preserve">Пульс Проекта 0.3.0 · стр. </w:t>
     </w:r>
     <w:r>
       <w:rPr/>
@@ -8859,7 +9998,7 @@
     </w:r>
     <w:r>
       <w:rPr/>
-      <w:t>18</w:t>
+      <w:t>20</w:t>
     </w:r>
     <w:r>
       <w:rPr/>

</xml_diff>

<commit_message>
docs: manuals for 0.4.0 — DOCX and PDF rebuilt
</commit_message>
<xml_diff>
--- a/docs/manuals/deployment-guide.docx
+++ b/docs/manuals/deployment-guide.docx
@@ -23,7 +23,7 @@
       </w:pPr>
       <w:r>
         <w:rPr/>
-        <w:t>Версия 0.3.1</w:t>
+        <w:t>Версия 0.4.0</w:t>
       </w:r>
     </w:p>
     <w:p>
@@ -93,7 +93,7 @@
             </w:rPr>
             <w:fldChar w:fldCharType="separate"/>
           </w:r>
-          <w:hyperlink w:anchor="__RefHeading___Toc2086_2394652293">
+          <w:hyperlink w:anchor="__RefHeading___Toc2146_1208937142">
             <w:r>
               <w:rPr>
                 <w:webHidden/>
@@ -114,7 +114,7 @@
             </w:tabs>
             <w:rPr/>
           </w:pPr>
-          <w:hyperlink w:anchor="__RefHeading___Toc2088_2394652293">
+          <w:hyperlink w:anchor="__RefHeading___Toc2148_1208937142">
             <w:r>
               <w:rPr>
                 <w:webHidden/>
@@ -135,7 +135,7 @@
             </w:tabs>
             <w:rPr/>
           </w:pPr>
-          <w:hyperlink w:anchor="__RefHeading___Toc2090_2394652293">
+          <w:hyperlink w:anchor="__RefHeading___Toc2150_1208937142">
             <w:r>
               <w:rPr>
                 <w:webHidden/>
@@ -156,7 +156,7 @@
             </w:tabs>
             <w:rPr/>
           </w:pPr>
-          <w:hyperlink w:anchor="__RefHeading___Toc2092_2394652293">
+          <w:hyperlink w:anchor="__RefHeading___Toc2152_1208937142">
             <w:r>
               <w:rPr>
                 <w:webHidden/>
@@ -177,7 +177,7 @@
             </w:tabs>
             <w:rPr/>
           </w:pPr>
-          <w:hyperlink w:anchor="__RefHeading___Toc2094_2394652293">
+          <w:hyperlink w:anchor="__RefHeading___Toc2154_1208937142">
             <w:r>
               <w:rPr>
                 <w:webHidden/>
@@ -198,7 +198,7 @@
             </w:tabs>
             <w:rPr/>
           </w:pPr>
-          <w:hyperlink w:anchor="__RefHeading___Toc2096_2394652293">
+          <w:hyperlink w:anchor="__RefHeading___Toc2156_1208937142">
             <w:r>
               <w:rPr>
                 <w:webHidden/>
@@ -219,7 +219,7 @@
             </w:tabs>
             <w:rPr/>
           </w:pPr>
-          <w:hyperlink w:anchor="__RefHeading___Toc2098_2394652293">
+          <w:hyperlink w:anchor="__RefHeading___Toc2158_1208937142">
             <w:r>
               <w:rPr>
                 <w:webHidden/>
@@ -240,7 +240,7 @@
             </w:tabs>
             <w:rPr/>
           </w:pPr>
-          <w:hyperlink w:anchor="__RefHeading___Toc2100_2394652293">
+          <w:hyperlink w:anchor="__RefHeading___Toc2160_1208937142">
             <w:r>
               <w:rPr>
                 <w:webHidden/>
@@ -261,7 +261,7 @@
             </w:tabs>
             <w:rPr/>
           </w:pPr>
-          <w:hyperlink w:anchor="__RefHeading___Toc2102_2394652293">
+          <w:hyperlink w:anchor="__RefHeading___Toc2162_1208937142">
             <w:r>
               <w:rPr>
                 <w:webHidden/>
@@ -282,7 +282,7 @@
             </w:tabs>
             <w:rPr/>
           </w:pPr>
-          <w:hyperlink w:anchor="__RefHeading___Toc2104_2394652293">
+          <w:hyperlink w:anchor="__RefHeading___Toc2164_1208937142">
             <w:r>
               <w:rPr>
                 <w:webHidden/>
@@ -303,7 +303,7 @@
             </w:tabs>
             <w:rPr/>
           </w:pPr>
-          <w:hyperlink w:anchor="__RefHeading___Toc2106_2394652293">
+          <w:hyperlink w:anchor="__RefHeading___Toc2166_1208937142">
             <w:r>
               <w:rPr>
                 <w:webHidden/>
@@ -324,7 +324,7 @@
             </w:tabs>
             <w:rPr/>
           </w:pPr>
-          <w:hyperlink w:anchor="__RefHeading___Toc2108_2394652293">
+          <w:hyperlink w:anchor="__RefHeading___Toc2168_1208937142">
             <w:r>
               <w:rPr>
                 <w:webHidden/>
@@ -345,7 +345,7 @@
             </w:tabs>
             <w:rPr/>
           </w:pPr>
-          <w:hyperlink w:anchor="__RefHeading___Toc2110_2394652293">
+          <w:hyperlink w:anchor="__RefHeading___Toc2170_1208937142">
             <w:r>
               <w:rPr>
                 <w:webHidden/>
@@ -366,7 +366,7 @@
             </w:tabs>
             <w:rPr/>
           </w:pPr>
-          <w:hyperlink w:anchor="__RefHeading___Toc2112_2394652293">
+          <w:hyperlink w:anchor="__RefHeading___Toc2172_1208937142">
             <w:r>
               <w:rPr>
                 <w:webHidden/>
@@ -387,7 +387,7 @@
             </w:tabs>
             <w:rPr/>
           </w:pPr>
-          <w:hyperlink w:anchor="__RefHeading___Toc2114_2394652293">
+          <w:hyperlink w:anchor="__RefHeading___Toc2174_1208937142">
             <w:r>
               <w:rPr>
                 <w:webHidden/>
@@ -408,7 +408,7 @@
             </w:tabs>
             <w:rPr/>
           </w:pPr>
-          <w:hyperlink w:anchor="__RefHeading___Toc2116_2394652293">
+          <w:hyperlink w:anchor="__RefHeading___Toc2176_1208937142">
             <w:r>
               <w:rPr>
                 <w:webHidden/>
@@ -429,7 +429,7 @@
             </w:tabs>
             <w:rPr/>
           </w:pPr>
-          <w:hyperlink w:anchor="__RefHeading___Toc2118_2394652293">
+          <w:hyperlink w:anchor="__RefHeading___Toc2178_1208937142">
             <w:r>
               <w:rPr>
                 <w:webHidden/>
@@ -450,13 +450,13 @@
             </w:tabs>
             <w:rPr/>
           </w:pPr>
-          <w:hyperlink w:anchor="__RefHeading___Toc2120_2394652293">
+          <w:hyperlink w:anchor="__RefHeading___Toc2180_1208937142">
             <w:r>
               <w:rPr>
                 <w:webHidden/>
                 <w:rStyle w:val="IndexLink"/>
               </w:rPr>
-              <w:t>6.4 Jira</w:t>
+              <w:t>6.4 Интеграции: Jira и «По Делу»</w:t>
               <w:tab/>
               <w:t>11</w:t>
             </w:r>
@@ -471,7 +471,7 @@
             </w:tabs>
             <w:rPr/>
           </w:pPr>
-          <w:hyperlink w:anchor="__RefHeading___Toc2122_2394652293">
+          <w:hyperlink w:anchor="__RefHeading___Toc2182_1208937142">
             <w:r>
               <w:rPr>
                 <w:webHidden/>
@@ -492,7 +492,7 @@
             </w:tabs>
             <w:rPr/>
           </w:pPr>
-          <w:hyperlink w:anchor="__RefHeading___Toc2124_2394652293">
+          <w:hyperlink w:anchor="__RefHeading___Toc2184_1208937142">
             <w:r>
               <w:rPr>
                 <w:webHidden/>
@@ -513,7 +513,7 @@
             </w:tabs>
             <w:rPr/>
           </w:pPr>
-          <w:hyperlink w:anchor="__RefHeading___Toc2126_2394652293">
+          <w:hyperlink w:anchor="__RefHeading___Toc2186_1208937142">
             <w:r>
               <w:rPr>
                 <w:webHidden/>
@@ -534,7 +534,7 @@
             </w:tabs>
             <w:rPr/>
           </w:pPr>
-          <w:hyperlink w:anchor="__RefHeading___Toc2128_2394652293">
+          <w:hyperlink w:anchor="__RefHeading___Toc2188_1208937142">
             <w:r>
               <w:rPr>
                 <w:webHidden/>
@@ -555,7 +555,7 @@
             </w:tabs>
             <w:rPr/>
           </w:pPr>
-          <w:hyperlink w:anchor="__RefHeading___Toc2130_2394652293">
+          <w:hyperlink w:anchor="__RefHeading___Toc2190_1208937142">
             <w:r>
               <w:rPr>
                 <w:webHidden/>
@@ -576,7 +576,7 @@
             </w:tabs>
             <w:rPr/>
           </w:pPr>
-          <w:hyperlink w:anchor="__RefHeading___Toc2132_2394652293">
+          <w:hyperlink w:anchor="__RefHeading___Toc2192_1208937142">
             <w:r>
               <w:rPr>
                 <w:webHidden/>
@@ -597,7 +597,7 @@
             </w:tabs>
             <w:rPr/>
           </w:pPr>
-          <w:hyperlink w:anchor="__RefHeading___Toc2134_2394652293">
+          <w:hyperlink w:anchor="__RefHeading___Toc2194_1208937142">
             <w:r>
               <w:rPr>
                 <w:webHidden/>
@@ -618,7 +618,7 @@
             </w:tabs>
             <w:rPr/>
           </w:pPr>
-          <w:hyperlink w:anchor="__RefHeading___Toc2136_2394652293">
+          <w:hyperlink w:anchor="__RefHeading___Toc2196_1208937142">
             <w:r>
               <w:rPr>
                 <w:webHidden/>
@@ -639,7 +639,7 @@
             </w:tabs>
             <w:rPr/>
           </w:pPr>
-          <w:hyperlink w:anchor="__RefHeading___Toc2138_2394652293">
+          <w:hyperlink w:anchor="__RefHeading___Toc2198_1208937142">
             <w:r>
               <w:rPr>
                 <w:webHidden/>
@@ -660,7 +660,7 @@
             </w:tabs>
             <w:rPr/>
           </w:pPr>
-          <w:hyperlink w:anchor="__RefHeading___Toc2140_2394652293">
+          <w:hyperlink w:anchor="__RefHeading___Toc2200_1208937142">
             <w:r>
               <w:rPr>
                 <w:webHidden/>
@@ -681,7 +681,7 @@
             </w:tabs>
             <w:rPr/>
           </w:pPr>
-          <w:hyperlink w:anchor="__RefHeading___Toc2142_2394652293">
+          <w:hyperlink w:anchor="__RefHeading___Toc2202_1208937142">
             <w:r>
               <w:rPr>
                 <w:webHidden/>
@@ -702,7 +702,7 @@
             </w:tabs>
             <w:rPr/>
           </w:pPr>
-          <w:hyperlink w:anchor="__RefHeading___Toc2144_2394652293">
+          <w:hyperlink w:anchor="__RefHeading___Toc2204_1208937142">
             <w:r>
               <w:rPr>
                 <w:webHidden/>
@@ -723,7 +723,7 @@
             </w:tabs>
             <w:rPr/>
           </w:pPr>
-          <w:hyperlink w:anchor="__RefHeading___Toc2146_2394652293">
+          <w:hyperlink w:anchor="__RefHeading___Toc2206_1208937142">
             <w:r>
               <w:rPr>
                 <w:webHidden/>
@@ -744,7 +744,7 @@
             </w:tabs>
             <w:rPr/>
           </w:pPr>
-          <w:hyperlink w:anchor="__RefHeading___Toc2148_2394652293">
+          <w:hyperlink w:anchor="__RefHeading___Toc2208_1208937142">
             <w:r>
               <w:rPr>
                 <w:webHidden/>
@@ -765,7 +765,7 @@
             </w:tabs>
             <w:rPr/>
           </w:pPr>
-          <w:hyperlink w:anchor="__RefHeading___Toc2150_2394652293">
+          <w:hyperlink w:anchor="__RefHeading___Toc2210_1208937142">
             <w:r>
               <w:rPr>
                 <w:webHidden/>
@@ -786,7 +786,7 @@
             </w:tabs>
             <w:rPr/>
           </w:pPr>
-          <w:hyperlink w:anchor="__RefHeading___Toc2152_2394652293">
+          <w:hyperlink w:anchor="__RefHeading___Toc2212_1208937142">
             <w:r>
               <w:rPr>
                 <w:webHidden/>
@@ -807,7 +807,7 @@
             </w:tabs>
             <w:rPr/>
           </w:pPr>
-          <w:hyperlink w:anchor="__RefHeading___Toc2154_2394652293">
+          <w:hyperlink w:anchor="__RefHeading___Toc2214_1208937142">
             <w:r>
               <w:rPr>
                 <w:webHidden/>
@@ -832,7 +832,7 @@
         <w:pStyle w:val="Heading1"/>
         <w:rPr/>
       </w:pPr>
-      <w:bookmarkStart w:id="0" w:name="__RefHeading___Toc2086_2394652293"/>
+      <w:bookmarkStart w:id="0" w:name="__RefHeading___Toc2146_1208937142"/>
       <w:bookmarkStart w:id="1" w:name="о-документе"/>
       <w:bookmarkEnd w:id="0"/>
       <w:r>
@@ -855,7 +855,7 @@
       <w:bookmarkStart w:id="2" w:name="о-документе"/>
       <w:r>
         <w:rPr/>
-        <w:t>Руководство описывает установку «Пульса Проекта» версии 0.3.1 на сервер компании, переход с версии 1.0.1, настройку HTTPS, резервное копирование и восстановление, обновление, наблюдение и диагностику. Документ предназначен для инженеров сопровождения. Работа в системе описана в руководствах пользователя и администратора.</w:t>
+        <w:t>Руководство описывает установку «Пульса Проекта» версии 0.4.0 на сервер компании, переход с версии 1.0.1, настройку HTTPS, резервное копирование и восстановление, обновление, наблюдение и диагностику. Документ предназначен для инженеров сопровождения. Работа в системе описана в руководствах пользователя и администратора.</w:t>
       </w:r>
       <w:bookmarkEnd w:id="2"/>
     </w:p>
@@ -864,7 +864,7 @@
         <w:pStyle w:val="Heading1"/>
         <w:rPr/>
       </w:pPr>
-      <w:bookmarkStart w:id="3" w:name="__RefHeading___Toc2088_2394652293"/>
+      <w:bookmarkStart w:id="3" w:name="__RefHeading___Toc2148_1208937142"/>
       <w:bookmarkStart w:id="4" w:name="архитектура"/>
       <w:bookmarkEnd w:id="3"/>
       <w:r>
@@ -1017,7 +1017,7 @@
         <w:pStyle w:val="Heading1"/>
         <w:rPr/>
       </w:pPr>
-      <w:bookmarkStart w:id="5" w:name="__RefHeading___Toc2090_2394652293"/>
+      <w:bookmarkStart w:id="5" w:name="__RefHeading___Toc2150_1208937142"/>
       <w:bookmarkStart w:id="6" w:name="требования"/>
       <w:bookmarkEnd w:id="5"/>
       <w:r>
@@ -1037,7 +1037,7 @@
         <w:pStyle w:val="Heading2"/>
         <w:rPr/>
       </w:pPr>
-      <w:bookmarkStart w:id="7" w:name="__RefHeading___Toc2092_2394652293"/>
+      <w:bookmarkStart w:id="7" w:name="__RefHeading___Toc2152_1208937142"/>
       <w:bookmarkStart w:id="8" w:name="сервер"/>
       <w:bookmarkEnd w:id="7"/>
       <w:r>
@@ -1558,7 +1558,7 @@
         <w:pStyle w:val="Heading2"/>
         <w:rPr/>
       </w:pPr>
-      <w:bookmarkStart w:id="9" w:name="__RefHeading___Toc2094_2394652293"/>
+      <w:bookmarkStart w:id="9" w:name="__RefHeading___Toc2154_1208937142"/>
       <w:bookmarkStart w:id="10" w:name="клиенты"/>
       <w:bookmarkEnd w:id="9"/>
       <w:r>
@@ -1592,7 +1592,7 @@
         <w:pStyle w:val="Heading1"/>
         <w:rPr/>
       </w:pPr>
-      <w:bookmarkStart w:id="13" w:name="__RefHeading___Toc2096_2394652293"/>
+      <w:bookmarkStart w:id="13" w:name="__RefHeading___Toc2156_1208937142"/>
       <w:bookmarkStart w:id="14" w:name="установка"/>
       <w:bookmarkEnd w:id="13"/>
       <w:r>
@@ -1612,7 +1612,7 @@
         <w:pStyle w:val="Heading2"/>
         <w:rPr/>
       </w:pPr>
-      <w:bookmarkStart w:id="15" w:name="__RefHeading___Toc2098_2394652293"/>
+      <w:bookmarkStart w:id="15" w:name="__RefHeading___Toc2158_1208937142"/>
       <w:bookmarkStart w:id="16" w:name="шаг-1.-получение-дистрибутива"/>
       <w:bookmarkEnd w:id="15"/>
       <w:r>
@@ -1654,7 +1654,7 @@
         <w:rPr>
           <w:rStyle w:val="NormalTok"/>
         </w:rPr>
-        <w:t xml:space="preserve"> v0.3.1 </w:t>
+        <w:t xml:space="preserve"> v0.4.0 </w:t>
       </w:r>
       <w:r>
         <w:rPr>
@@ -1703,7 +1703,7 @@
         <w:pStyle w:val="Heading2"/>
         <w:rPr/>
       </w:pPr>
-      <w:bookmarkStart w:id="17" w:name="__RefHeading___Toc2100_2394652293"/>
+      <w:bookmarkStart w:id="17" w:name="__RefHeading___Toc2160_1208937142"/>
       <w:bookmarkStart w:id="18" w:name="шаг-2.-конфигурация"/>
       <w:bookmarkEnd w:id="17"/>
       <w:r>
@@ -1892,7 +1892,7 @@
         <w:pStyle w:val="Heading2"/>
         <w:rPr/>
       </w:pPr>
-      <w:bookmarkStart w:id="19" w:name="__RefHeading___Toc2102_2394652293"/>
+      <w:bookmarkStart w:id="19" w:name="__RefHeading___Toc2162_1208937142"/>
       <w:bookmarkStart w:id="20" w:name="шаг-3.-сборка-и-запуск"/>
       <w:bookmarkEnd w:id="19"/>
       <w:r>
@@ -2035,7 +2035,7 @@
         <w:pStyle w:val="Heading2"/>
         <w:rPr/>
       </w:pPr>
-      <w:bookmarkStart w:id="21" w:name="__RefHeading___Toc2104_2394652293"/>
+      <w:bookmarkStart w:id="21" w:name="__RefHeading___Toc2164_1208937142"/>
       <w:bookmarkStart w:id="22" w:name="шаг-4.-проверка"/>
       <w:bookmarkEnd w:id="21"/>
       <w:r>
@@ -2105,7 +2105,7 @@
         <w:rPr>
           <w:rStyle w:val="CommentTok"/>
         </w:rPr>
-        <w:t># {"status":"ok","schema":"0004_department_access","version":"0.3.1"}</w:t>
+        <w:t># {"status":"ok","schema":"0005_podelu_links","version":"0.4.0"}</w:t>
       </w:r>
       <w:r>
         <w:rPr/>
@@ -2198,7 +2198,7 @@
         <w:pStyle w:val="Heading2"/>
         <w:rPr/>
       </w:pPr>
-      <w:bookmarkStart w:id="23" w:name="__RefHeading___Toc2106_2394652293"/>
+      <w:bookmarkStart w:id="23" w:name="__RefHeading___Toc2166_1208937142"/>
       <w:bookmarkStart w:id="24" w:name="шаг-5.-https"/>
       <w:bookmarkEnd w:id="23"/>
       <w:r>
@@ -2527,7 +2527,7 @@
         <w:pStyle w:val="Heading2"/>
         <w:rPr/>
       </w:pPr>
-      <w:bookmarkStart w:id="25" w:name="__RefHeading___Toc2108_2394652293"/>
+      <w:bookmarkStart w:id="25" w:name="__RefHeading___Toc2168_1208937142"/>
       <w:bookmarkStart w:id="26" w:name="шаг-6.-первый-вход"/>
       <w:bookmarkEnd w:id="25"/>
       <w:r>
@@ -2611,7 +2611,7 @@
         <w:pStyle w:val="Heading1"/>
         <w:rPr/>
       </w:pPr>
-      <w:bookmarkStart w:id="27" w:name="__RefHeading___Toc2110_2394652293"/>
+      <w:bookmarkStart w:id="27" w:name="__RefHeading___Toc2170_1208937142"/>
       <w:bookmarkStart w:id="28" w:name="переход-с-1.0.1"/>
       <w:bookmarkEnd w:id="27"/>
       <w:r>
@@ -2863,7 +2863,7 @@
         <w:pStyle w:val="Heading1"/>
         <w:rPr/>
       </w:pPr>
-      <w:bookmarkStart w:id="30" w:name="__RefHeading___Toc2112_2394652293"/>
+      <w:bookmarkStart w:id="30" w:name="__RefHeading___Toc2172_1208937142"/>
       <w:bookmarkEnd w:id="30"/>
       <w:r>
         <w:rPr>
@@ -2882,7 +2882,7 @@
         <w:pStyle w:val="Heading2"/>
         <w:rPr/>
       </w:pPr>
-      <w:bookmarkStart w:id="31" w:name="__RefHeading___Toc2114_2394652293"/>
+      <w:bookmarkStart w:id="31" w:name="__RefHeading___Toc2174_1208937142"/>
       <w:bookmarkEnd w:id="31"/>
       <w:r>
         <w:rPr>
@@ -3904,7 +3904,7 @@
         <w:pStyle w:val="Heading2"/>
         <w:rPr/>
       </w:pPr>
-      <w:bookmarkStart w:id="33" w:name="__RefHeading___Toc2116_2394652293"/>
+      <w:bookmarkStart w:id="33" w:name="__RefHeading___Toc2176_1208937142"/>
       <w:bookmarkEnd w:id="33"/>
       <w:r>
         <w:rPr>
@@ -4587,7 +4587,7 @@
         <w:pStyle w:val="Heading2"/>
         <w:rPr/>
       </w:pPr>
-      <w:bookmarkStart w:id="34" w:name="__RefHeading___Toc2118_2394652293"/>
+      <w:bookmarkStart w:id="34" w:name="__RefHeading___Toc2178_1208937142"/>
       <w:bookmarkEnd w:id="34"/>
       <w:r>
         <w:rPr>
@@ -5155,7 +5155,7 @@
         <w:pStyle w:val="Heading2"/>
         <w:rPr/>
       </w:pPr>
-      <w:bookmarkStart w:id="35" w:name="__RefHeading___Toc2120_2394652293"/>
+      <w:bookmarkStart w:id="35" w:name="__RefHeading___Toc2180_1208937142"/>
       <w:bookmarkEnd w:id="35"/>
       <w:r>
         <w:rPr>
@@ -5166,7 +5166,7 @@
       <w:r>
         <w:rPr/>
         <w:tab/>
-        <w:t>Jira</w:t>
+        <w:t>Интеграции: Jira и «По Делу»</w:t>
       </w:r>
     </w:p>
     <w:tbl>
@@ -5185,9 +5185,9 @@
         <w:tblLook w:val="0020" w:noHBand="0" w:noVBand="0" w:firstColumn="0" w:lastRow="0" w:lastColumn="0" w:firstRow="1"/>
       </w:tblPr>
       <w:tblGrid>
-        <w:gridCol w:w="2451"/>
-        <w:gridCol w:w="1226"/>
-        <w:gridCol w:w="5683"/>
+        <w:gridCol w:w="2468"/>
+        <w:gridCol w:w="1131"/>
+        <w:gridCol w:w="5761"/>
       </w:tblGrid>
       <w:tr>
         <w:trPr>
@@ -5195,7 +5195,7 @@
         </w:trPr>
         <w:tc>
           <w:tcPr>
-            <w:tcW w:w="2451" w:type="dxa"/>
+            <w:tcW w:w="2468" w:type="dxa"/>
             <w:tcBorders>
               <w:top w:val="single" w:sz="4" w:space="0" w:color="D6DCEA"/>
               <w:left w:val="single" w:sz="4" w:space="0" w:color="D6DCEA"/>
@@ -5231,7 +5231,7 @@
         </w:tc>
         <w:tc>
           <w:tcPr>
-            <w:tcW w:w="1226" w:type="dxa"/>
+            <w:tcW w:w="1131" w:type="dxa"/>
             <w:tcBorders>
               <w:top w:val="single" w:sz="4" w:space="0" w:color="D6DCEA"/>
               <w:left w:val="single" w:sz="4" w:space="0" w:color="D6DCEA"/>
@@ -5267,7 +5267,7 @@
         </w:tc>
         <w:tc>
           <w:tcPr>
-            <w:tcW w:w="5683" w:type="dxa"/>
+            <w:tcW w:w="5761" w:type="dxa"/>
             <w:tcBorders>
               <w:top w:val="single" w:sz="4" w:space="0" w:color="D6DCEA"/>
               <w:left w:val="single" w:sz="4" w:space="0" w:color="D6DCEA"/>
@@ -5306,7 +5306,7 @@
         <w:trPr/>
         <w:tc>
           <w:tcPr>
-            <w:tcW w:w="2451" w:type="dxa"/>
+            <w:tcW w:w="2468" w:type="dxa"/>
             <w:tcBorders>
               <w:top w:val="single" w:sz="4" w:space="0" w:color="D6DCEA"/>
               <w:left w:val="single" w:sz="4" w:space="0" w:color="D6DCEA"/>
@@ -5340,7 +5340,7 @@
         </w:tc>
         <w:tc>
           <w:tcPr>
-            <w:tcW w:w="1226" w:type="dxa"/>
+            <w:tcW w:w="1131" w:type="dxa"/>
             <w:tcBorders>
               <w:top w:val="single" w:sz="4" w:space="0" w:color="D6DCEA"/>
               <w:left w:val="single" w:sz="4" w:space="0" w:color="D6DCEA"/>
@@ -5373,7 +5373,7 @@
         </w:tc>
         <w:tc>
           <w:tcPr>
-            <w:tcW w:w="5683" w:type="dxa"/>
+            <w:tcW w:w="5761" w:type="dxa"/>
             <w:tcBorders>
               <w:top w:val="single" w:sz="4" w:space="0" w:color="D6DCEA"/>
               <w:left w:val="single" w:sz="4" w:space="0" w:color="D6DCEA"/>
@@ -5447,7 +5447,7 @@
         <w:trPr/>
         <w:tc>
           <w:tcPr>
-            <w:tcW w:w="2451" w:type="dxa"/>
+            <w:tcW w:w="2468" w:type="dxa"/>
             <w:tcBorders>
               <w:top w:val="single" w:sz="4" w:space="0" w:color="D6DCEA"/>
               <w:left w:val="single" w:sz="4" w:space="0" w:color="D6DCEA"/>
@@ -5481,7 +5481,7 @@
         </w:tc>
         <w:tc>
           <w:tcPr>
-            <w:tcW w:w="1226" w:type="dxa"/>
+            <w:tcW w:w="1131" w:type="dxa"/>
             <w:tcBorders>
               <w:top w:val="single" w:sz="4" w:space="0" w:color="D6DCEA"/>
               <w:left w:val="single" w:sz="4" w:space="0" w:color="D6DCEA"/>
@@ -5515,7 +5515,7 @@
         </w:tc>
         <w:tc>
           <w:tcPr>
-            <w:tcW w:w="5683" w:type="dxa"/>
+            <w:tcW w:w="5761" w:type="dxa"/>
             <w:tcBorders>
               <w:top w:val="single" w:sz="4" w:space="0" w:color="D6DCEA"/>
               <w:left w:val="single" w:sz="4" w:space="0" w:color="D6DCEA"/>
@@ -5551,7 +5551,7 @@
         <w:trPr/>
         <w:tc>
           <w:tcPr>
-            <w:tcW w:w="2451" w:type="dxa"/>
+            <w:tcW w:w="2468" w:type="dxa"/>
             <w:tcBorders>
               <w:top w:val="single" w:sz="4" w:space="0" w:color="D6DCEA"/>
               <w:left w:val="single" w:sz="4" w:space="0" w:color="D6DCEA"/>
@@ -5579,6 +5579,261 @@
                 <w:szCs w:val="24"/>
                 <w:lang w:val="ru-RU" w:eastAsia="en-US" w:bidi="ar-SA"/>
               </w:rPr>
+              <w:t>PODELU_ALLOWED_HOSTS</w:t>
+            </w:r>
+          </w:p>
+        </w:tc>
+        <w:tc>
+          <w:tcPr>
+            <w:tcW w:w="1131" w:type="dxa"/>
+            <w:tcBorders>
+              <w:top w:val="single" w:sz="4" w:space="0" w:color="D6DCEA"/>
+              <w:left w:val="single" w:sz="4" w:space="0" w:color="D6DCEA"/>
+              <w:bottom w:val="single" w:sz="4" w:space="0" w:color="D6DCEA"/>
+              <w:right w:val="single" w:sz="4" w:space="0" w:color="D6DCEA"/>
+            </w:tcBorders>
+          </w:tcPr>
+          <w:p>
+            <w:pPr>
+              <w:pStyle w:val="Compact"/>
+              <w:widowControl/>
+              <w:spacing w:before="36" w:after="40"/>
+              <w:jc w:val="left"/>
+              <w:rPr>
+                <w:kern w:val="0"/>
+                <w:szCs w:val="24"/>
+                <w:lang w:val="ru-RU" w:eastAsia="en-US" w:bidi="ar-SA"/>
+              </w:rPr>
+            </w:pPr>
+            <w:r>
+              <w:rPr>
+                <w:kern w:val="0"/>
+                <w:sz w:val="18"/>
+                <w:szCs w:val="24"/>
+                <w:lang w:val="ru-RU" w:eastAsia="en-US" w:bidi="ar-SA"/>
+              </w:rPr>
+              <w:t>—</w:t>
+            </w:r>
+          </w:p>
+        </w:tc>
+        <w:tc>
+          <w:tcPr>
+            <w:tcW w:w="5761" w:type="dxa"/>
+            <w:tcBorders>
+              <w:top w:val="single" w:sz="4" w:space="0" w:color="D6DCEA"/>
+              <w:left w:val="single" w:sz="4" w:space="0" w:color="D6DCEA"/>
+              <w:bottom w:val="single" w:sz="4" w:space="0" w:color="D6DCEA"/>
+              <w:right w:val="single" w:sz="4" w:space="0" w:color="D6DCEA"/>
+            </w:tcBorders>
+          </w:tcPr>
+          <w:p>
+            <w:pPr>
+              <w:pStyle w:val="Compact"/>
+              <w:widowControl/>
+              <w:spacing w:before="36" w:after="40"/>
+              <w:jc w:val="left"/>
+              <w:rPr>
+                <w:kern w:val="0"/>
+                <w:szCs w:val="24"/>
+                <w:lang w:val="ru-RU" w:eastAsia="en-US" w:bidi="ar-SA"/>
+              </w:rPr>
+            </w:pPr>
+            <w:r>
+              <w:rPr>
+                <w:kern w:val="0"/>
+                <w:sz w:val="18"/>
+                <w:szCs w:val="24"/>
+                <w:lang w:val="ru-RU" w:eastAsia="en-US" w:bidi="ar-SA"/>
+              </w:rPr>
+              <w:t xml:space="preserve">Разрешённые адреса «По Делу» — так же, как </w:t>
+            </w:r>
+            <w:r>
+              <w:rPr>
+                <w:rStyle w:val="VerbatimChar"/>
+                <w:kern w:val="0"/>
+                <w:sz w:val="18"/>
+                <w:szCs w:val="24"/>
+                <w:lang w:val="ru-RU" w:eastAsia="en-US" w:bidi="ar-SA"/>
+              </w:rPr>
+              <w:t>JIRA_ALLOWED_HOSTS</w:t>
+            </w:r>
+          </w:p>
+        </w:tc>
+      </w:tr>
+      <w:tr>
+        <w:trPr/>
+        <w:tc>
+          <w:tcPr>
+            <w:tcW w:w="2468" w:type="dxa"/>
+            <w:tcBorders>
+              <w:top w:val="single" w:sz="4" w:space="0" w:color="D6DCEA"/>
+              <w:left w:val="single" w:sz="4" w:space="0" w:color="D6DCEA"/>
+              <w:bottom w:val="single" w:sz="4" w:space="0" w:color="D6DCEA"/>
+              <w:right w:val="single" w:sz="4" w:space="0" w:color="D6DCEA"/>
+            </w:tcBorders>
+          </w:tcPr>
+          <w:p>
+            <w:pPr>
+              <w:pStyle w:val="Compact"/>
+              <w:widowControl/>
+              <w:spacing w:before="36" w:after="40"/>
+              <w:jc w:val="left"/>
+              <w:rPr>
+                <w:kern w:val="0"/>
+                <w:szCs w:val="24"/>
+                <w:lang w:val="ru-RU" w:eastAsia="en-US" w:bidi="ar-SA"/>
+              </w:rPr>
+            </w:pPr>
+            <w:r>
+              <w:rPr>
+                <w:rStyle w:val="VerbatimChar"/>
+                <w:kern w:val="0"/>
+                <w:sz w:val="18"/>
+                <w:szCs w:val="24"/>
+                <w:lang w:val="ru-RU" w:eastAsia="en-US" w:bidi="ar-SA"/>
+              </w:rPr>
+              <w:t>PODELU_TOTAL_TIMEOUT</w:t>
+            </w:r>
+          </w:p>
+        </w:tc>
+        <w:tc>
+          <w:tcPr>
+            <w:tcW w:w="1131" w:type="dxa"/>
+            <w:tcBorders>
+              <w:top w:val="single" w:sz="4" w:space="0" w:color="D6DCEA"/>
+              <w:left w:val="single" w:sz="4" w:space="0" w:color="D6DCEA"/>
+              <w:bottom w:val="single" w:sz="4" w:space="0" w:color="D6DCEA"/>
+              <w:right w:val="single" w:sz="4" w:space="0" w:color="D6DCEA"/>
+            </w:tcBorders>
+          </w:tcPr>
+          <w:p>
+            <w:pPr>
+              <w:pStyle w:val="Compact"/>
+              <w:widowControl/>
+              <w:spacing w:before="36" w:after="40"/>
+              <w:jc w:val="left"/>
+              <w:rPr>
+                <w:kern w:val="0"/>
+                <w:szCs w:val="24"/>
+                <w:lang w:val="ru-RU" w:eastAsia="en-US" w:bidi="ar-SA"/>
+              </w:rPr>
+            </w:pPr>
+            <w:r>
+              <w:rPr>
+                <w:rStyle w:val="VerbatimChar"/>
+                <w:kern w:val="0"/>
+                <w:sz w:val="18"/>
+                <w:szCs w:val="24"/>
+                <w:lang w:val="ru-RU" w:eastAsia="en-US" w:bidi="ar-SA"/>
+              </w:rPr>
+              <w:t>50</w:t>
+            </w:r>
+          </w:p>
+        </w:tc>
+        <w:tc>
+          <w:tcPr>
+            <w:tcW w:w="5761" w:type="dxa"/>
+            <w:tcBorders>
+              <w:top w:val="single" w:sz="4" w:space="0" w:color="D6DCEA"/>
+              <w:left w:val="single" w:sz="4" w:space="0" w:color="D6DCEA"/>
+              <w:bottom w:val="single" w:sz="4" w:space="0" w:color="D6DCEA"/>
+              <w:right w:val="single" w:sz="4" w:space="0" w:color="D6DCEA"/>
+            </w:tcBorders>
+          </w:tcPr>
+          <w:p>
+            <w:pPr>
+              <w:pStyle w:val="Compact"/>
+              <w:widowControl/>
+              <w:spacing w:before="36" w:after="40"/>
+              <w:jc w:val="left"/>
+              <w:rPr>
+                <w:kern w:val="0"/>
+                <w:szCs w:val="24"/>
+                <w:lang w:val="ru-RU" w:eastAsia="en-US" w:bidi="ar-SA"/>
+              </w:rPr>
+            </w:pPr>
+            <w:r>
+              <w:rPr>
+                <w:kern w:val="0"/>
+                <w:sz w:val="18"/>
+                <w:szCs w:val="24"/>
+                <w:lang w:val="ru-RU" w:eastAsia="en-US" w:bidi="ar-SA"/>
+              </w:rPr>
+              <w:t xml:space="preserve">Сколько секунд одна загрузка из «По Делу» в интерфейсе может ждать её ответа целиком (вход, выгрузки, выход); меньше </w:t>
+            </w:r>
+            <w:r>
+              <w:rPr>
+                <w:rStyle w:val="VerbatimChar"/>
+                <w:kern w:val="0"/>
+                <w:sz w:val="18"/>
+                <w:szCs w:val="24"/>
+                <w:lang w:val="ru-RU" w:eastAsia="en-US" w:bidi="ar-SA"/>
+              </w:rPr>
+              <w:t>GUNICORN_TIMEOUT</w:t>
+            </w:r>
+            <w:r>
+              <w:rPr>
+                <w:kern w:val="0"/>
+                <w:sz w:val="18"/>
+                <w:szCs w:val="24"/>
+                <w:lang w:val="ru-RU" w:eastAsia="en-US" w:bidi="ar-SA"/>
+              </w:rPr>
+              <w:t xml:space="preserve"> (60). Командная строка </w:t>
+            </w:r>
+            <w:r>
+              <w:rPr>
+                <w:rStyle w:val="VerbatimChar"/>
+                <w:kern w:val="0"/>
+                <w:sz w:val="18"/>
+                <w:szCs w:val="24"/>
+                <w:lang w:val="ru-RU" w:eastAsia="en-US" w:bidi="ar-SA"/>
+              </w:rPr>
+              <w:t>sync-podelu</w:t>
+            </w:r>
+            <w:r>
+              <w:rPr>
+                <w:kern w:val="0"/>
+                <w:sz w:val="18"/>
+                <w:szCs w:val="24"/>
+                <w:lang w:val="ru-RU" w:eastAsia="en-US" w:bidi="ar-SA"/>
+              </w:rPr>
+              <w:t xml:space="preserve"> ждёт до 600 секунд</w:t>
+            </w:r>
+          </w:p>
+        </w:tc>
+      </w:tr>
+      <w:tr>
+        <w:trPr/>
+        <w:tc>
+          <w:tcPr>
+            <w:tcW w:w="2468" w:type="dxa"/>
+            <w:tcBorders>
+              <w:top w:val="single" w:sz="4" w:space="0" w:color="D6DCEA"/>
+              <w:left w:val="single" w:sz="4" w:space="0" w:color="D6DCEA"/>
+              <w:bottom w:val="single" w:sz="4" w:space="0" w:color="D6DCEA"/>
+              <w:right w:val="single" w:sz="4" w:space="0" w:color="D6DCEA"/>
+            </w:tcBorders>
+          </w:tcPr>
+          <w:p>
+            <w:pPr>
+              <w:pStyle w:val="Compact"/>
+              <w:widowControl/>
+              <w:spacing w:before="36" w:after="40"/>
+              <w:jc w:val="left"/>
+              <w:rPr>
+                <w:kern w:val="0"/>
+                <w:szCs w:val="24"/>
+                <w:lang w:val="ru-RU" w:eastAsia="en-US" w:bidi="ar-SA"/>
+              </w:rPr>
+            </w:pPr>
+            <w:r>
+              <w:rPr>
+                <w:rStyle w:val="VerbatimChar"/>
+                <w:kern w:val="0"/>
+                <w:sz w:val="18"/>
+                <w:szCs w:val="24"/>
+                <w:lang w:val="ru-RU" w:eastAsia="en-US" w:bidi="ar-SA"/>
+              </w:rPr>
               <w:t>HTTPS_PROXY</w:t>
             </w:r>
             <w:r>
@@ -5623,7 +5878,7 @@
         </w:tc>
         <w:tc>
           <w:tcPr>
-            <w:tcW w:w="1226" w:type="dxa"/>
+            <w:tcW w:w="1131" w:type="dxa"/>
             <w:tcBorders>
               <w:top w:val="single" w:sz="4" w:space="0" w:color="D6DCEA"/>
               <w:left w:val="single" w:sz="4" w:space="0" w:color="D6DCEA"/>
@@ -5656,7 +5911,7 @@
         </w:tc>
         <w:tc>
           <w:tcPr>
-            <w:tcW w:w="5683" w:type="dxa"/>
+            <w:tcW w:w="5761" w:type="dxa"/>
             <w:tcBorders>
               <w:top w:val="single" w:sz="4" w:space="0" w:color="D6DCEA"/>
               <w:left w:val="single" w:sz="4" w:space="0" w:color="D6DCEA"/>
@@ -5683,7 +5938,17 @@
                 <w:szCs w:val="24"/>
                 <w:lang w:val="ru-RU" w:eastAsia="en-US" w:bidi="ar-SA"/>
               </w:rPr>
-              <w:t>Прокси для выхода backend к Jira, если сервер ходит в сеть через прокси</w:t>
+              <w:t xml:space="preserve">Прокси для выхода backend к Jira и «По Делу», если сервер ходит в сеть через прокси. «По Делу» на той же машине — в </w:t>
+            </w:r>
+            <w:r>
+              <w:rPr>
+                <w:rStyle w:val="VerbatimChar"/>
+                <w:kern w:val="0"/>
+                <w:sz w:val="18"/>
+                <w:szCs w:val="24"/>
+                <w:lang w:val="ru-RU" w:eastAsia="en-US" w:bidi="ar-SA"/>
+              </w:rPr>
+              <w:t>NO_PROXY</w:t>
             </w:r>
           </w:p>
         </w:tc>
@@ -5696,7 +5961,7 @@
       </w:pPr>
       <w:r>
         <w:rPr/>
-        <w:t xml:space="preserve">Само подключение (адрес, учётная запись, токен) задаёт администратор в интерфейсе: «Администрирование → Интеграции». Токен хранится в базе зашифрованным ключом из </w:t>
+        <w:t xml:space="preserve">Сами подключения (адрес, учётная запись, пароль или токен) задаёт администратор в интерфейсе: «Администрирование → Интеграции». Пароли хранятся в базе зашифрованными ключом из </w:t>
       </w:r>
       <w:r>
         <w:rPr>
@@ -5716,15 +5981,35 @@
       </w:r>
       <w:r>
         <w:rPr/>
-        <w:t xml:space="preserve"> токен нужно ввести заново.</w:t>
+        <w:t xml:space="preserve"> их нужно ввести заново.</w:t>
       </w:r>
     </w:p>
     <w:p>
       <w:pPr>
+        <w:pStyle w:val="BodyText"/>
+        <w:rPr/>
+      </w:pPr>
+      <w:r>
+        <w:rPr/>
+        <w:t xml:space="preserve">Если «По Делу» работает на той же машине, backend «Пульса» обращается к ней по тому же адресу, что и сотрудники (через HTTPS-прокси сервера или по </w:t>
+      </w:r>
+      <w:r>
+        <w:rPr>
+          <w:rStyle w:val="VerbatimChar"/>
+        </w:rPr>
+        <w:t>http://&lt;адрес сервера&gt;:39665</w:t>
+      </w:r>
+      <w:r>
+        <w:rPr/>
+        <w:t>): контейнеры систем в разных сетях Docker и по внутренним именам друг друга не видят.</w:t>
+      </w:r>
+    </w:p>
+    <w:p>
+      <w:pPr>
         <w:pStyle w:val="Heading2"/>
         <w:rPr/>
       </w:pPr>
-      <w:bookmarkStart w:id="36" w:name="__RefHeading___Toc2122_2394652293"/>
+      <w:bookmarkStart w:id="36" w:name="__RefHeading___Toc2182_1208937142"/>
       <w:bookmarkEnd w:id="36"/>
       <w:r>
         <w:rPr>
@@ -6212,7 +6497,7 @@
         <w:pStyle w:val="Heading1"/>
         <w:rPr/>
       </w:pPr>
-      <w:bookmarkStart w:id="39" w:name="__RefHeading___Toc2124_2394652293"/>
+      <w:bookmarkStart w:id="39" w:name="__RefHeading___Toc2184_1208937142"/>
       <w:bookmarkEnd w:id="39"/>
       <w:r>
         <w:rPr>
@@ -6717,7 +7002,7 @@
         <w:pStyle w:val="Heading1"/>
         <w:rPr/>
       </w:pPr>
-      <w:bookmarkStart w:id="40" w:name="__RefHeading___Toc2126_2394652293"/>
+      <w:bookmarkStart w:id="40" w:name="__RefHeading___Toc2186_1208937142"/>
       <w:bookmarkStart w:id="41" w:name="резервное-копирование-и-восстановление"/>
       <w:bookmarkEnd w:id="40"/>
       <w:r>
@@ -6737,7 +7022,7 @@
         <w:pStyle w:val="Heading2"/>
         <w:rPr/>
       </w:pPr>
-      <w:bookmarkStart w:id="42" w:name="__RefHeading___Toc2128_2394652293"/>
+      <w:bookmarkStart w:id="42" w:name="__RefHeading___Toc2188_1208937142"/>
       <w:bookmarkStart w:id="43" w:name="копии"/>
       <w:bookmarkEnd w:id="42"/>
       <w:r>
@@ -6964,7 +7249,7 @@
         <w:pStyle w:val="Heading2"/>
         <w:rPr/>
       </w:pPr>
-      <w:bookmarkStart w:id="44" w:name="__RefHeading___Toc2130_2394652293"/>
+      <w:bookmarkStart w:id="44" w:name="__RefHeading___Toc2190_1208937142"/>
       <w:bookmarkStart w:id="45" w:name="восстановление"/>
       <w:bookmarkEnd w:id="44"/>
       <w:r>
@@ -7090,7 +7375,7 @@
         <w:pStyle w:val="Heading1"/>
         <w:rPr/>
       </w:pPr>
-      <w:bookmarkStart w:id="46" w:name="__RefHeading___Toc2132_2394652293"/>
+      <w:bookmarkStart w:id="46" w:name="__RefHeading___Toc2192_1208937142"/>
       <w:bookmarkStart w:id="47" w:name="обновление"/>
       <w:bookmarkEnd w:id="46"/>
       <w:r>
@@ -7110,7 +7395,7 @@
         <w:pStyle w:val="Heading2"/>
         <w:rPr/>
       </w:pPr>
-      <w:bookmarkStart w:id="48" w:name="__RefHeading___Toc2134_2394652293"/>
+      <w:bookmarkStart w:id="48" w:name="__RefHeading___Toc2194_1208937142"/>
       <w:bookmarkStart w:id="49" w:name="обычный-порядок"/>
       <w:bookmarkEnd w:id="48"/>
       <w:r>
@@ -7194,7 +7479,7 @@
         <w:rPr>
           <w:rStyle w:val="NormalTok"/>
         </w:rPr>
-        <w:t xml:space="preserve"> sh deploy/update.sh v0.3.1</w:t>
+        <w:t xml:space="preserve"> sh deploy/update.sh v0.4.0</w:t>
       </w:r>
     </w:p>
     <w:p>
@@ -7257,7 +7542,7 @@
         <w:pStyle w:val="Heading2"/>
         <w:rPr/>
       </w:pPr>
-      <w:bookmarkStart w:id="50" w:name="__RefHeading___Toc2136_2394652293"/>
+      <w:bookmarkStart w:id="50" w:name="__RefHeading___Toc2196_1208937142"/>
       <w:bookmarkStart w:id="51" w:name="откат"/>
       <w:bookmarkEnd w:id="50"/>
       <w:r>
@@ -7475,7 +7760,7 @@
         <w:pStyle w:val="Heading1"/>
         <w:rPr/>
       </w:pPr>
-      <w:bookmarkStart w:id="52" w:name="__RefHeading___Toc2138_2394652293"/>
+      <w:bookmarkStart w:id="52" w:name="__RefHeading___Toc2198_1208937142"/>
       <w:bookmarkStart w:id="53" w:name="наблюдение-и-журналы"/>
       <w:bookmarkEnd w:id="52"/>
       <w:r>
@@ -7495,7 +7780,7 @@
         <w:pStyle w:val="Heading2"/>
         <w:rPr/>
       </w:pPr>
-      <w:bookmarkStart w:id="54" w:name="__RefHeading___Toc2140_2394652293"/>
+      <w:bookmarkStart w:id="54" w:name="__RefHeading___Toc2200_1208937142"/>
       <w:bookmarkStart w:id="55" w:name="проверки"/>
       <w:bookmarkEnd w:id="54"/>
       <w:r>
@@ -7863,7 +8148,7 @@
         <w:pStyle w:val="Heading2"/>
         <w:rPr/>
       </w:pPr>
-      <w:bookmarkStart w:id="56" w:name="__RefHeading___Toc2142_2394652293"/>
+      <w:bookmarkStart w:id="56" w:name="__RefHeading___Toc2202_1208937142"/>
       <w:bookmarkStart w:id="57" w:name="журналы"/>
       <w:bookmarkEnd w:id="56"/>
       <w:r>
@@ -8017,7 +8302,7 @@
         <w:pStyle w:val="Heading1"/>
         <w:rPr/>
       </w:pPr>
-      <w:bookmarkStart w:id="58" w:name="__RefHeading___Toc2144_2394652293"/>
+      <w:bookmarkStart w:id="58" w:name="__RefHeading___Toc2204_1208937142"/>
       <w:bookmarkStart w:id="59" w:name="безопасность"/>
       <w:bookmarkEnd w:id="58"/>
       <w:r>
@@ -8149,7 +8434,7 @@
         <w:pStyle w:val="Heading1"/>
         <w:rPr/>
       </w:pPr>
-      <w:bookmarkStart w:id="61" w:name="__RefHeading___Toc2146_2394652293"/>
+      <w:bookmarkStart w:id="61" w:name="__RefHeading___Toc2206_1208937142"/>
       <w:bookmarkStart w:id="62" w:name="масштабирование"/>
       <w:bookmarkEnd w:id="61"/>
       <w:r>
@@ -8242,7 +8527,7 @@
         <w:pStyle w:val="Heading1"/>
         <w:rPr/>
       </w:pPr>
-      <w:bookmarkStart w:id="63" w:name="__RefHeading___Toc2148_2394652293"/>
+      <w:bookmarkStart w:id="63" w:name="__RefHeading___Toc2208_1208937142"/>
       <w:bookmarkStart w:id="64" w:name="Xe0b46952fee8bc72ba399f90b2ae089e5d10a04"/>
       <w:bookmarkEnd w:id="63"/>
       <w:r>
@@ -8654,7 +8939,7 @@
         <w:pStyle w:val="Heading1"/>
         <w:rPr/>
       </w:pPr>
-      <w:bookmarkStart w:id="65" w:name="__RefHeading___Toc2150_2394652293"/>
+      <w:bookmarkStart w:id="65" w:name="__RefHeading___Toc2210_1208937142"/>
       <w:bookmarkStart w:id="66" w:name="установка-в-закрытом-контуре"/>
       <w:bookmarkEnd w:id="65"/>
       <w:r>
@@ -8778,7 +9063,7 @@
         <w:rPr>
           <w:rStyle w:val="NormalTok"/>
         </w:rPr>
-        <w:t xml:space="preserve"> puls-0.3.1-images.tar.gz</w:t>
+        <w:t xml:space="preserve"> puls-0.4.0-images.tar.gz</w:t>
       </w:r>
     </w:p>
     <w:p>
@@ -8818,7 +9103,7 @@
         <w:rPr>
           <w:rStyle w:val="NormalTok"/>
         </w:rPr>
-        <w:t xml:space="preserve"> puls-0.3.1-images.tar.gz </w:t>
+        <w:t xml:space="preserve"> puls-0.4.0-images.tar.gz </w:t>
       </w:r>
       <w:r>
         <w:rPr>
@@ -8931,7 +9216,7 @@
         <w:pStyle w:val="Heading1"/>
         <w:rPr/>
       </w:pPr>
-      <w:bookmarkStart w:id="67" w:name="__RefHeading___Toc2152_2394652293"/>
+      <w:bookmarkStart w:id="67" w:name="__RefHeading___Toc2212_1208937142"/>
       <w:bookmarkEnd w:id="67"/>
       <w:r>
         <w:rPr>
@@ -10177,7 +10462,7 @@
         <w:pStyle w:val="Heading1"/>
         <w:rPr/>
       </w:pPr>
-      <w:bookmarkStart w:id="69" w:name="__RefHeading___Toc2154_2394652293"/>
+      <w:bookmarkStart w:id="69" w:name="__RefHeading___Toc2214_1208937142"/>
       <w:bookmarkEnd w:id="69"/>
       <w:r>
         <w:rPr>
@@ -10698,7 +10983,7 @@
         <w:color w:val="8A92A6"/>
         <w:sz w:val="16"/>
       </w:rPr>
-      <w:t xml:space="preserve">Пульс Проекта 0.3.1 · стр. </w:t>
+      <w:t xml:space="preserve">Пульс Проекта 0.4.0 · стр. </w:t>
     </w:r>
     <w:r>
       <w:rPr/>
@@ -10737,7 +11022,7 @@
         <w:color w:val="8A92A6"/>
         <w:sz w:val="16"/>
       </w:rPr>
-      <w:t xml:space="preserve">Пульс Проекта 0.3.1 · стр. </w:t>
+      <w:t xml:space="preserve">Пульс Проекта 0.4.0 · стр. </w:t>
     </w:r>
     <w:r>
       <w:rPr/>

</xml_diff>

<commit_message>
docs: screenshots and DOCX/PDF manuals for 0.5.0
Co-Authored-By: Claude Opus 5.5 <noreply@anthropic.com>
Claude-Session: https://claude.ai/code/session_017NjWirKMy41kFVgS7LPoiF
</commit_message>
<xml_diff>
--- a/docs/manuals/deployment-guide.docx
+++ b/docs/manuals/deployment-guide.docx
@@ -23,7 +23,7 @@
       </w:pPr>
       <w:r>
         <w:rPr/>
-        <w:t>Версия 0.4.0</w:t>
+        <w:t>Версия 0.5.0</w:t>
       </w:r>
     </w:p>
     <w:p>
@@ -93,7 +93,7 @@
             </w:rPr>
             <w:fldChar w:fldCharType="separate"/>
           </w:r>
-          <w:hyperlink w:anchor="__RefHeading___Toc2146_1208937142">
+          <w:hyperlink w:anchor="__RefHeading___Toc2194_1986438947">
             <w:r>
               <w:rPr>
                 <w:webHidden/>
@@ -114,7 +114,7 @@
             </w:tabs>
             <w:rPr/>
           </w:pPr>
-          <w:hyperlink w:anchor="__RefHeading___Toc2148_1208937142">
+          <w:hyperlink w:anchor="__RefHeading___Toc2196_1986438947">
             <w:r>
               <w:rPr>
                 <w:webHidden/>
@@ -135,7 +135,7 @@
             </w:tabs>
             <w:rPr/>
           </w:pPr>
-          <w:hyperlink w:anchor="__RefHeading___Toc2150_1208937142">
+          <w:hyperlink w:anchor="__RefHeading___Toc2198_1986438947">
             <w:r>
               <w:rPr>
                 <w:webHidden/>
@@ -156,7 +156,7 @@
             </w:tabs>
             <w:rPr/>
           </w:pPr>
-          <w:hyperlink w:anchor="__RefHeading___Toc2152_1208937142">
+          <w:hyperlink w:anchor="__RefHeading___Toc2200_1986438947">
             <w:r>
               <w:rPr>
                 <w:webHidden/>
@@ -177,7 +177,7 @@
             </w:tabs>
             <w:rPr/>
           </w:pPr>
-          <w:hyperlink w:anchor="__RefHeading___Toc2154_1208937142">
+          <w:hyperlink w:anchor="__RefHeading___Toc2202_1986438947">
             <w:r>
               <w:rPr>
                 <w:webHidden/>
@@ -198,7 +198,7 @@
             </w:tabs>
             <w:rPr/>
           </w:pPr>
-          <w:hyperlink w:anchor="__RefHeading___Toc2156_1208937142">
+          <w:hyperlink w:anchor="__RefHeading___Toc2204_1986438947">
             <w:r>
               <w:rPr>
                 <w:webHidden/>
@@ -219,7 +219,7 @@
             </w:tabs>
             <w:rPr/>
           </w:pPr>
-          <w:hyperlink w:anchor="__RefHeading___Toc2158_1208937142">
+          <w:hyperlink w:anchor="__RefHeading___Toc2206_1986438947">
             <w:r>
               <w:rPr>
                 <w:webHidden/>
@@ -240,7 +240,7 @@
             </w:tabs>
             <w:rPr/>
           </w:pPr>
-          <w:hyperlink w:anchor="__RefHeading___Toc2160_1208937142">
+          <w:hyperlink w:anchor="__RefHeading___Toc2208_1986438947">
             <w:r>
               <w:rPr>
                 <w:webHidden/>
@@ -261,7 +261,7 @@
             </w:tabs>
             <w:rPr/>
           </w:pPr>
-          <w:hyperlink w:anchor="__RefHeading___Toc2162_1208937142">
+          <w:hyperlink w:anchor="__RefHeading___Toc2210_1986438947">
             <w:r>
               <w:rPr>
                 <w:webHidden/>
@@ -282,7 +282,7 @@
             </w:tabs>
             <w:rPr/>
           </w:pPr>
-          <w:hyperlink w:anchor="__RefHeading___Toc2164_1208937142">
+          <w:hyperlink w:anchor="__RefHeading___Toc2212_1986438947">
             <w:r>
               <w:rPr>
                 <w:webHidden/>
@@ -303,7 +303,7 @@
             </w:tabs>
             <w:rPr/>
           </w:pPr>
-          <w:hyperlink w:anchor="__RefHeading___Toc2166_1208937142">
+          <w:hyperlink w:anchor="__RefHeading___Toc2214_1986438947">
             <w:r>
               <w:rPr>
                 <w:webHidden/>
@@ -324,7 +324,7 @@
             </w:tabs>
             <w:rPr/>
           </w:pPr>
-          <w:hyperlink w:anchor="__RefHeading___Toc2168_1208937142">
+          <w:hyperlink w:anchor="__RefHeading___Toc2216_1986438947">
             <w:r>
               <w:rPr>
                 <w:webHidden/>
@@ -345,7 +345,7 @@
             </w:tabs>
             <w:rPr/>
           </w:pPr>
-          <w:hyperlink w:anchor="__RefHeading___Toc2170_1208937142">
+          <w:hyperlink w:anchor="__RefHeading___Toc2218_1986438947">
             <w:r>
               <w:rPr>
                 <w:webHidden/>
@@ -366,7 +366,7 @@
             </w:tabs>
             <w:rPr/>
           </w:pPr>
-          <w:hyperlink w:anchor="__RefHeading___Toc2172_1208937142">
+          <w:hyperlink w:anchor="__RefHeading___Toc2220_1986438947">
             <w:r>
               <w:rPr>
                 <w:webHidden/>
@@ -387,7 +387,7 @@
             </w:tabs>
             <w:rPr/>
           </w:pPr>
-          <w:hyperlink w:anchor="__RefHeading___Toc2174_1208937142">
+          <w:hyperlink w:anchor="__RefHeading___Toc2222_1986438947">
             <w:r>
               <w:rPr>
                 <w:webHidden/>
@@ -408,7 +408,7 @@
             </w:tabs>
             <w:rPr/>
           </w:pPr>
-          <w:hyperlink w:anchor="__RefHeading___Toc2176_1208937142">
+          <w:hyperlink w:anchor="__RefHeading___Toc2224_1986438947">
             <w:r>
               <w:rPr>
                 <w:webHidden/>
@@ -429,7 +429,7 @@
             </w:tabs>
             <w:rPr/>
           </w:pPr>
-          <w:hyperlink w:anchor="__RefHeading___Toc2178_1208937142">
+          <w:hyperlink w:anchor="__RefHeading___Toc2226_1986438947">
             <w:r>
               <w:rPr>
                 <w:webHidden/>
@@ -450,7 +450,7 @@
             </w:tabs>
             <w:rPr/>
           </w:pPr>
-          <w:hyperlink w:anchor="__RefHeading___Toc2180_1208937142">
+          <w:hyperlink w:anchor="__RefHeading___Toc2228_1986438947">
             <w:r>
               <w:rPr>
                 <w:webHidden/>
@@ -471,7 +471,7 @@
             </w:tabs>
             <w:rPr/>
           </w:pPr>
-          <w:hyperlink w:anchor="__RefHeading___Toc2182_1208937142">
+          <w:hyperlink w:anchor="__RefHeading___Toc2230_1986438947">
             <w:r>
               <w:rPr>
                 <w:webHidden/>
@@ -492,7 +492,7 @@
             </w:tabs>
             <w:rPr/>
           </w:pPr>
-          <w:hyperlink w:anchor="__RefHeading___Toc2184_1208937142">
+          <w:hyperlink w:anchor="__RefHeading___Toc2232_1986438947">
             <w:r>
               <w:rPr>
                 <w:webHidden/>
@@ -513,7 +513,7 @@
             </w:tabs>
             <w:rPr/>
           </w:pPr>
-          <w:hyperlink w:anchor="__RefHeading___Toc2186_1208937142">
+          <w:hyperlink w:anchor="__RefHeading___Toc2234_1986438947">
             <w:r>
               <w:rPr>
                 <w:webHidden/>
@@ -534,7 +534,7 @@
             </w:tabs>
             <w:rPr/>
           </w:pPr>
-          <w:hyperlink w:anchor="__RefHeading___Toc2188_1208937142">
+          <w:hyperlink w:anchor="__RefHeading___Toc2236_1986438947">
             <w:r>
               <w:rPr>
                 <w:webHidden/>
@@ -555,7 +555,7 @@
             </w:tabs>
             <w:rPr/>
           </w:pPr>
-          <w:hyperlink w:anchor="__RefHeading___Toc2190_1208937142">
+          <w:hyperlink w:anchor="__RefHeading___Toc2238_1986438947">
             <w:r>
               <w:rPr>
                 <w:webHidden/>
@@ -576,7 +576,7 @@
             </w:tabs>
             <w:rPr/>
           </w:pPr>
-          <w:hyperlink w:anchor="__RefHeading___Toc2192_1208937142">
+          <w:hyperlink w:anchor="__RefHeading___Toc2240_1986438947">
             <w:r>
               <w:rPr>
                 <w:webHidden/>
@@ -597,7 +597,7 @@
             </w:tabs>
             <w:rPr/>
           </w:pPr>
-          <w:hyperlink w:anchor="__RefHeading___Toc2194_1208937142">
+          <w:hyperlink w:anchor="__RefHeading___Toc2242_1986438947">
             <w:r>
               <w:rPr>
                 <w:webHidden/>
@@ -618,7 +618,7 @@
             </w:tabs>
             <w:rPr/>
           </w:pPr>
-          <w:hyperlink w:anchor="__RefHeading___Toc2196_1208937142">
+          <w:hyperlink w:anchor="__RefHeading___Toc2244_1986438947">
             <w:r>
               <w:rPr>
                 <w:webHidden/>
@@ -639,7 +639,7 @@
             </w:tabs>
             <w:rPr/>
           </w:pPr>
-          <w:hyperlink w:anchor="__RefHeading___Toc2198_1208937142">
+          <w:hyperlink w:anchor="__RefHeading___Toc2246_1986438947">
             <w:r>
               <w:rPr>
                 <w:webHidden/>
@@ -660,7 +660,7 @@
             </w:tabs>
             <w:rPr/>
           </w:pPr>
-          <w:hyperlink w:anchor="__RefHeading___Toc2200_1208937142">
+          <w:hyperlink w:anchor="__RefHeading___Toc2248_1986438947">
             <w:r>
               <w:rPr>
                 <w:webHidden/>
@@ -681,7 +681,7 @@
             </w:tabs>
             <w:rPr/>
           </w:pPr>
-          <w:hyperlink w:anchor="__RefHeading___Toc2202_1208937142">
+          <w:hyperlink w:anchor="__RefHeading___Toc2250_1986438947">
             <w:r>
               <w:rPr>
                 <w:webHidden/>
@@ -702,7 +702,7 @@
             </w:tabs>
             <w:rPr/>
           </w:pPr>
-          <w:hyperlink w:anchor="__RefHeading___Toc2204_1208937142">
+          <w:hyperlink w:anchor="__RefHeading___Toc2252_1986438947">
             <w:r>
               <w:rPr>
                 <w:webHidden/>
@@ -723,7 +723,7 @@
             </w:tabs>
             <w:rPr/>
           </w:pPr>
-          <w:hyperlink w:anchor="__RefHeading___Toc2206_1208937142">
+          <w:hyperlink w:anchor="__RefHeading___Toc2254_1986438947">
             <w:r>
               <w:rPr>
                 <w:webHidden/>
@@ -744,7 +744,7 @@
             </w:tabs>
             <w:rPr/>
           </w:pPr>
-          <w:hyperlink w:anchor="__RefHeading___Toc2208_1208937142">
+          <w:hyperlink w:anchor="__RefHeading___Toc2256_1986438947">
             <w:r>
               <w:rPr>
                 <w:webHidden/>
@@ -765,7 +765,7 @@
             </w:tabs>
             <w:rPr/>
           </w:pPr>
-          <w:hyperlink w:anchor="__RefHeading___Toc2210_1208937142">
+          <w:hyperlink w:anchor="__RefHeading___Toc2258_1986438947">
             <w:r>
               <w:rPr>
                 <w:webHidden/>
@@ -786,7 +786,7 @@
             </w:tabs>
             <w:rPr/>
           </w:pPr>
-          <w:hyperlink w:anchor="__RefHeading___Toc2212_1208937142">
+          <w:hyperlink w:anchor="__RefHeading___Toc2260_1986438947">
             <w:r>
               <w:rPr>
                 <w:webHidden/>
@@ -807,7 +807,7 @@
             </w:tabs>
             <w:rPr/>
           </w:pPr>
-          <w:hyperlink w:anchor="__RefHeading___Toc2214_1208937142">
+          <w:hyperlink w:anchor="__RefHeading___Toc2262_1986438947">
             <w:r>
               <w:rPr>
                 <w:webHidden/>
@@ -832,7 +832,7 @@
         <w:pStyle w:val="Heading1"/>
         <w:rPr/>
       </w:pPr>
-      <w:bookmarkStart w:id="0" w:name="__RefHeading___Toc2146_1208937142"/>
+      <w:bookmarkStart w:id="0" w:name="__RefHeading___Toc2194_1986438947"/>
       <w:bookmarkStart w:id="1" w:name="о-документе"/>
       <w:bookmarkEnd w:id="0"/>
       <w:r>
@@ -864,7 +864,7 @@
         <w:pStyle w:val="Heading1"/>
         <w:rPr/>
       </w:pPr>
-      <w:bookmarkStart w:id="3" w:name="__RefHeading___Toc2148_1208937142"/>
+      <w:bookmarkStart w:id="3" w:name="__RefHeading___Toc2196_1986438947"/>
       <w:bookmarkStart w:id="4" w:name="архитектура"/>
       <w:bookmarkEnd w:id="3"/>
       <w:r>
@@ -1017,7 +1017,7 @@
         <w:pStyle w:val="Heading1"/>
         <w:rPr/>
       </w:pPr>
-      <w:bookmarkStart w:id="5" w:name="__RefHeading___Toc2150_1208937142"/>
+      <w:bookmarkStart w:id="5" w:name="__RefHeading___Toc2198_1986438947"/>
       <w:bookmarkStart w:id="6" w:name="требования"/>
       <w:bookmarkEnd w:id="5"/>
       <w:r>
@@ -1037,7 +1037,7 @@
         <w:pStyle w:val="Heading2"/>
         <w:rPr/>
       </w:pPr>
-      <w:bookmarkStart w:id="7" w:name="__RefHeading___Toc2152_1208937142"/>
+      <w:bookmarkStart w:id="7" w:name="__RefHeading___Toc2200_1986438947"/>
       <w:bookmarkStart w:id="8" w:name="сервер"/>
       <w:bookmarkEnd w:id="7"/>
       <w:r>
@@ -1558,7 +1558,7 @@
         <w:pStyle w:val="Heading2"/>
         <w:rPr/>
       </w:pPr>
-      <w:bookmarkStart w:id="9" w:name="__RefHeading___Toc2154_1208937142"/>
+      <w:bookmarkStart w:id="9" w:name="__RefHeading___Toc2202_1986438947"/>
       <w:bookmarkStart w:id="10" w:name="клиенты"/>
       <w:bookmarkEnd w:id="9"/>
       <w:r>
@@ -1592,7 +1592,7 @@
         <w:pStyle w:val="Heading1"/>
         <w:rPr/>
       </w:pPr>
-      <w:bookmarkStart w:id="13" w:name="__RefHeading___Toc2156_1208937142"/>
+      <w:bookmarkStart w:id="13" w:name="__RefHeading___Toc2204_1986438947"/>
       <w:bookmarkStart w:id="14" w:name="установка"/>
       <w:bookmarkEnd w:id="13"/>
       <w:r>
@@ -1612,7 +1612,7 @@
         <w:pStyle w:val="Heading2"/>
         <w:rPr/>
       </w:pPr>
-      <w:bookmarkStart w:id="15" w:name="__RefHeading___Toc2158_1208937142"/>
+      <w:bookmarkStart w:id="15" w:name="__RefHeading___Toc2206_1986438947"/>
       <w:bookmarkStart w:id="16" w:name="шаг-1.-получение-дистрибутива"/>
       <w:bookmarkEnd w:id="15"/>
       <w:r>
@@ -1654,7 +1654,7 @@
         <w:rPr>
           <w:rStyle w:val="NormalTok"/>
         </w:rPr>
-        <w:t xml:space="preserve"> v0.4.0 </w:t>
+        <w:t xml:space="preserve"> v0.5.0 </w:t>
       </w:r>
       <w:r>
         <w:rPr>
@@ -1703,7 +1703,7 @@
         <w:pStyle w:val="Heading2"/>
         <w:rPr/>
       </w:pPr>
-      <w:bookmarkStart w:id="17" w:name="__RefHeading___Toc2160_1208937142"/>
+      <w:bookmarkStart w:id="17" w:name="__RefHeading___Toc2208_1986438947"/>
       <w:bookmarkStart w:id="18" w:name="шаг-2.-конфигурация"/>
       <w:bookmarkEnd w:id="17"/>
       <w:r>
@@ -1892,7 +1892,7 @@
         <w:pStyle w:val="Heading2"/>
         <w:rPr/>
       </w:pPr>
-      <w:bookmarkStart w:id="19" w:name="__RefHeading___Toc2162_1208937142"/>
+      <w:bookmarkStart w:id="19" w:name="__RefHeading___Toc2210_1986438947"/>
       <w:bookmarkStart w:id="20" w:name="шаг-3.-сборка-и-запуск"/>
       <w:bookmarkEnd w:id="19"/>
       <w:r>
@@ -2035,7 +2035,7 @@
         <w:pStyle w:val="Heading2"/>
         <w:rPr/>
       </w:pPr>
-      <w:bookmarkStart w:id="21" w:name="__RefHeading___Toc2164_1208937142"/>
+      <w:bookmarkStart w:id="21" w:name="__RefHeading___Toc2212_1986438947"/>
       <w:bookmarkStart w:id="22" w:name="шаг-4.-проверка"/>
       <w:bookmarkEnd w:id="21"/>
       <w:r>
@@ -2105,7 +2105,7 @@
         <w:rPr>
           <w:rStyle w:val="CommentTok"/>
         </w:rPr>
-        <w:t># {"status":"ok","schema":"0005_podelu_links","version":"0.4.0"}</w:t>
+        <w:t># {"status":"ok","schema":"0005_podelu_links","version":"0.5.0"}</w:t>
       </w:r>
       <w:r>
         <w:rPr/>
@@ -2198,7 +2198,7 @@
         <w:pStyle w:val="Heading2"/>
         <w:rPr/>
       </w:pPr>
-      <w:bookmarkStart w:id="23" w:name="__RefHeading___Toc2166_1208937142"/>
+      <w:bookmarkStart w:id="23" w:name="__RefHeading___Toc2214_1986438947"/>
       <w:bookmarkStart w:id="24" w:name="шаг-5.-https"/>
       <w:bookmarkEnd w:id="23"/>
       <w:r>
@@ -2527,7 +2527,7 @@
         <w:pStyle w:val="Heading2"/>
         <w:rPr/>
       </w:pPr>
-      <w:bookmarkStart w:id="25" w:name="__RefHeading___Toc2168_1208937142"/>
+      <w:bookmarkStart w:id="25" w:name="__RefHeading___Toc2216_1986438947"/>
       <w:bookmarkStart w:id="26" w:name="шаг-6.-первый-вход"/>
       <w:bookmarkEnd w:id="25"/>
       <w:r>
@@ -2611,7 +2611,7 @@
         <w:pStyle w:val="Heading1"/>
         <w:rPr/>
       </w:pPr>
-      <w:bookmarkStart w:id="27" w:name="__RefHeading___Toc2170_1208937142"/>
+      <w:bookmarkStart w:id="27" w:name="__RefHeading___Toc2218_1986438947"/>
       <w:bookmarkStart w:id="28" w:name="переход-с-1.0.1"/>
       <w:bookmarkEnd w:id="27"/>
       <w:r>
@@ -2863,7 +2863,7 @@
         <w:pStyle w:val="Heading1"/>
         <w:rPr/>
       </w:pPr>
-      <w:bookmarkStart w:id="30" w:name="__RefHeading___Toc2172_1208937142"/>
+      <w:bookmarkStart w:id="30" w:name="__RefHeading___Toc2220_1986438947"/>
       <w:bookmarkEnd w:id="30"/>
       <w:r>
         <w:rPr>
@@ -2882,7 +2882,7 @@
         <w:pStyle w:val="Heading2"/>
         <w:rPr/>
       </w:pPr>
-      <w:bookmarkStart w:id="31" w:name="__RefHeading___Toc2174_1208937142"/>
+      <w:bookmarkStart w:id="31" w:name="__RefHeading___Toc2222_1986438947"/>
       <w:bookmarkEnd w:id="31"/>
       <w:r>
         <w:rPr>
@@ -3904,7 +3904,7 @@
         <w:pStyle w:val="Heading2"/>
         <w:rPr/>
       </w:pPr>
-      <w:bookmarkStart w:id="33" w:name="__RefHeading___Toc2176_1208937142"/>
+      <w:bookmarkStart w:id="33" w:name="__RefHeading___Toc2224_1986438947"/>
       <w:bookmarkEnd w:id="33"/>
       <w:r>
         <w:rPr>
@@ -4587,7 +4587,7 @@
         <w:pStyle w:val="Heading2"/>
         <w:rPr/>
       </w:pPr>
-      <w:bookmarkStart w:id="34" w:name="__RefHeading___Toc2178_1208937142"/>
+      <w:bookmarkStart w:id="34" w:name="__RefHeading___Toc2226_1986438947"/>
       <w:bookmarkEnd w:id="34"/>
       <w:r>
         <w:rPr>
@@ -5155,7 +5155,7 @@
         <w:pStyle w:val="Heading2"/>
         <w:rPr/>
       </w:pPr>
-      <w:bookmarkStart w:id="35" w:name="__RefHeading___Toc2180_1208937142"/>
+      <w:bookmarkStart w:id="35" w:name="__RefHeading___Toc2228_1986438947"/>
       <w:bookmarkEnd w:id="35"/>
       <w:r>
         <w:rPr>
@@ -5961,7 +5961,18 @@
       </w:pPr>
       <w:r>
         <w:rPr/>
-        <w:t xml:space="preserve">Сами подключения (адрес, учётная запись, пароль или токен) задаёт администратор в интерфейсе: «Администрирование → Интеграции». Пароли хранятся в базе зашифрованными ключом из </w:t>
+        <w:t xml:space="preserve">Сами подключения (адрес, учётная запись, пароль, токен или ключ) задаёт администратор в интерфейсе: блок </w:t>
+      </w:r>
+      <w:r>
+        <w:rPr>
+          <w:b/>
+          <w:bCs/>
+        </w:rPr>
+        <w:t>Интеграции</w:t>
+      </w:r>
+      <w:r>
+        <w:rPr/>
+        <w:t xml:space="preserve"> бокового меню. Пароли и ключи других систем хранятся в базе зашифрованными ключом из </w:t>
       </w:r>
       <w:r>
         <w:rPr>
@@ -5990,26 +6001,133 @@
         <w:rPr/>
       </w:pPr>
       <w:r>
-        <w:rPr/>
-        <w:t xml:space="preserve">Если «По Делу» работает на той же машине, backend «Пульса» обращается к ней по тому же адресу, что и сотрудники (через HTTPS-прокси сервера или по </w:t>
+        <w:rPr>
+          <w:b/>
+          <w:bCs/>
+        </w:rPr>
+        <w:t>Ссылки из задач «По Делу»</w:t>
+      </w:r>
+      <w:r>
+        <w:rPr/>
+        <w:t xml:space="preserve"> (0.5.0, нужна «По Делу» 1.5.0) работают в обе стороны: backend «Пульса» обращается к «По Делу» по </w:t>
       </w:r>
       <w:r>
         <w:rPr>
           <w:rStyle w:val="VerbatimChar"/>
         </w:rPr>
-        <w:t>http://&lt;адрес сервера&gt;:39665</w:t>
-      </w:r>
-      <w:r>
-        <w:rPr/>
-        <w:t>): контейнеры систем в разных сетях Docker и по внутренним именам друг друга не видят.</w:t>
+        <w:t>/api/integrations/puls/…</w:t>
+      </w:r>
+      <w:r>
+        <w:rPr/>
+        <w:t xml:space="preserve">, а backend «По Делу» — к «Пульсу» по </w:t>
+      </w:r>
+      <w:r>
+        <w:rPr>
+          <w:rStyle w:val="VerbatimChar"/>
+        </w:rPr>
+        <w:t>/api/integration/v1/…</w:t>
+      </w:r>
+      <w:r>
+        <w:rPr/>
+        <w:t xml:space="preserve"> с заголовком </w:t>
+      </w:r>
+      <w:r>
+        <w:rPr>
+          <w:rStyle w:val="VerbatimChar"/>
+        </w:rPr>
+        <w:t>Authorization: Bearer puls_…</w:t>
+      </w:r>
+      <w:r>
+        <w:rPr/>
+        <w:t xml:space="preserve"> и без cookie. Обратный прокси перед «Пульсом» должен пропускать </w:t>
+      </w:r>
+      <w:r>
+        <w:rPr>
+          <w:rStyle w:val="VerbatimChar"/>
+        </w:rPr>
+        <w:t>/api/integration/</w:t>
+      </w:r>
+      <w:r>
+        <w:rPr/>
+        <w:t xml:space="preserve"> так же, как остальной </w:t>
+      </w:r>
+      <w:r>
+        <w:rPr>
+          <w:rStyle w:val="VerbatimChar"/>
+        </w:rPr>
+        <w:t>/api/</w:t>
+      </w:r>
+      <w:r>
+        <w:rPr/>
+        <w:t xml:space="preserve"> (в </w:t>
+      </w:r>
+      <w:r>
+        <w:rPr>
+          <w:rStyle w:val="VerbatimChar"/>
+        </w:rPr>
+        <w:t>nginx.conf</w:t>
+      </w:r>
+      <w:r>
+        <w:rPr/>
+        <w:t xml:space="preserve"> и </w:t>
+      </w:r>
+      <w:r>
+        <w:rPr>
+          <w:rStyle w:val="VerbatimChar"/>
+        </w:rPr>
+        <w:t>Caddyfile.example</w:t>
+      </w:r>
+      <w:r>
+        <w:rPr/>
+        <w:t xml:space="preserve"> из поставки так и есть), а сеть — разрешать запросы между серверами в обе стороны. Адреса «По Делу» ограничивает </w:t>
+      </w:r>
+      <w:r>
+        <w:rPr>
+          <w:rStyle w:val="VerbatimChar"/>
+        </w:rPr>
+        <w:t>PODELU_ALLOWED_HOSTS</w:t>
+      </w:r>
+      <w:r>
+        <w:rPr/>
+        <w:t xml:space="preserve">, адреса «Пульса» на стороне «По Делу» — её переменная </w:t>
+      </w:r>
+      <w:r>
+        <w:rPr>
+          <w:rStyle w:val="VerbatimChar"/>
+        </w:rPr>
+        <w:t>PULS_ALLOWED_HOSTS</w:t>
+      </w:r>
+      <w:r>
+        <w:rPr/>
+        <w:t>. Проверка: «Интеграции → «По Делу» → Проверить связь» в «Пульсе» и «Проверить подключение» в «По Делу».</w:t>
       </w:r>
     </w:p>
     <w:p>
       <w:pPr>
+        <w:pStyle w:val="BodyText"/>
+        <w:rPr/>
+      </w:pPr>
+      <w:r>
+        <w:rPr/>
+        <w:t xml:space="preserve">Если «По Делу» работает на той же машине, backend «Пульса» обращается к ней по тому же адресу, что и сотрудники (через HTTPS-прокси сервера или по </w:t>
+      </w:r>
+      <w:r>
+        <w:rPr>
+          <w:rStyle w:val="VerbatimChar"/>
+        </w:rPr>
+        <w:t>http://&lt;адрес сервера&gt;:39665</w:t>
+      </w:r>
+      <w:r>
+        <w:rPr/>
+        <w:t>): контейнеры систем в разных сетях Docker и по внутренним именам друг друга не видят.</w:t>
+      </w:r>
+    </w:p>
+    <w:p>
+      <w:pPr>
         <w:pStyle w:val="Heading2"/>
         <w:rPr/>
       </w:pPr>
-      <w:bookmarkStart w:id="36" w:name="__RefHeading___Toc2182_1208937142"/>
+      <w:bookmarkStart w:id="36" w:name="__RefHeading___Toc2230_1986438947"/>
       <w:bookmarkEnd w:id="36"/>
       <w:r>
         <w:rPr>
@@ -6497,7 +6615,7 @@
         <w:pStyle w:val="Heading1"/>
         <w:rPr/>
       </w:pPr>
-      <w:bookmarkStart w:id="39" w:name="__RefHeading___Toc2184_1208937142"/>
+      <w:bookmarkStart w:id="39" w:name="__RefHeading___Toc2232_1986438947"/>
       <w:bookmarkEnd w:id="39"/>
       <w:r>
         <w:rPr>
@@ -6994,7 +7112,7 @@
       </w:pPr>
       <w:r>
         <w:rPr/>
-        <w:t>Подключение к каталогу берётся из «Администрирование → Настройки → Вход через домен», параметры синхронизации — со страницы «Импорт и экспорт → Active Directory».</w:t>
+        <w:t>Подключение к каталогу берётся из «Интеграции → Вход через домен», параметры синхронизации — со страницы «Импорт и экспорт → Active Directory».</w:t>
       </w:r>
     </w:p>
     <w:p>
@@ -7002,7 +7120,7 @@
         <w:pStyle w:val="Heading1"/>
         <w:rPr/>
       </w:pPr>
-      <w:bookmarkStart w:id="40" w:name="__RefHeading___Toc2186_1208937142"/>
+      <w:bookmarkStart w:id="40" w:name="__RefHeading___Toc2234_1986438947"/>
       <w:bookmarkStart w:id="41" w:name="резервное-копирование-и-восстановление"/>
       <w:bookmarkEnd w:id="40"/>
       <w:r>
@@ -7022,7 +7140,7 @@
         <w:pStyle w:val="Heading2"/>
         <w:rPr/>
       </w:pPr>
-      <w:bookmarkStart w:id="42" w:name="__RefHeading___Toc2188_1208937142"/>
+      <w:bookmarkStart w:id="42" w:name="__RefHeading___Toc2236_1986438947"/>
       <w:bookmarkStart w:id="43" w:name="копии"/>
       <w:bookmarkEnd w:id="42"/>
       <w:r>
@@ -7249,7 +7367,7 @@
         <w:pStyle w:val="Heading2"/>
         <w:rPr/>
       </w:pPr>
-      <w:bookmarkStart w:id="44" w:name="__RefHeading___Toc2190_1208937142"/>
+      <w:bookmarkStart w:id="44" w:name="__RefHeading___Toc2238_1986438947"/>
       <w:bookmarkStart w:id="45" w:name="восстановление"/>
       <w:bookmarkEnd w:id="44"/>
       <w:r>
@@ -7375,7 +7493,7 @@
         <w:pStyle w:val="Heading1"/>
         <w:rPr/>
       </w:pPr>
-      <w:bookmarkStart w:id="46" w:name="__RefHeading___Toc2192_1208937142"/>
+      <w:bookmarkStart w:id="46" w:name="__RefHeading___Toc2240_1986438947"/>
       <w:bookmarkStart w:id="47" w:name="обновление"/>
       <w:bookmarkEnd w:id="46"/>
       <w:r>
@@ -7395,7 +7513,7 @@
         <w:pStyle w:val="Heading2"/>
         <w:rPr/>
       </w:pPr>
-      <w:bookmarkStart w:id="48" w:name="__RefHeading___Toc2194_1208937142"/>
+      <w:bookmarkStart w:id="48" w:name="__RefHeading___Toc2242_1986438947"/>
       <w:bookmarkStart w:id="49" w:name="обычный-порядок"/>
       <w:bookmarkEnd w:id="48"/>
       <w:r>
@@ -7479,7 +7597,7 @@
         <w:rPr>
           <w:rStyle w:val="NormalTok"/>
         </w:rPr>
-        <w:t xml:space="preserve"> sh deploy/update.sh v0.4.0</w:t>
+        <w:t xml:space="preserve"> sh deploy/update.sh v0.5.0</w:t>
       </w:r>
     </w:p>
     <w:p>
@@ -7542,7 +7660,7 @@
         <w:pStyle w:val="Heading2"/>
         <w:rPr/>
       </w:pPr>
-      <w:bookmarkStart w:id="50" w:name="__RefHeading___Toc2196_1208937142"/>
+      <w:bookmarkStart w:id="50" w:name="__RefHeading___Toc2244_1986438947"/>
       <w:bookmarkStart w:id="51" w:name="откат"/>
       <w:bookmarkEnd w:id="50"/>
       <w:r>
@@ -7760,7 +7878,7 @@
         <w:pStyle w:val="Heading1"/>
         <w:rPr/>
       </w:pPr>
-      <w:bookmarkStart w:id="52" w:name="__RefHeading___Toc2198_1208937142"/>
+      <w:bookmarkStart w:id="52" w:name="__RefHeading___Toc2246_1986438947"/>
       <w:bookmarkStart w:id="53" w:name="наблюдение-и-журналы"/>
       <w:bookmarkEnd w:id="52"/>
       <w:r>
@@ -7780,7 +7898,7 @@
         <w:pStyle w:val="Heading2"/>
         <w:rPr/>
       </w:pPr>
-      <w:bookmarkStart w:id="54" w:name="__RefHeading___Toc2200_1208937142"/>
+      <w:bookmarkStart w:id="54" w:name="__RefHeading___Toc2248_1986438947"/>
       <w:bookmarkStart w:id="55" w:name="проверки"/>
       <w:bookmarkEnd w:id="54"/>
       <w:r>
@@ -8148,7 +8266,7 @@
         <w:pStyle w:val="Heading2"/>
         <w:rPr/>
       </w:pPr>
-      <w:bookmarkStart w:id="56" w:name="__RefHeading___Toc2202_1208937142"/>
+      <w:bookmarkStart w:id="56" w:name="__RefHeading___Toc2250_1986438947"/>
       <w:bookmarkStart w:id="57" w:name="журналы"/>
       <w:bookmarkEnd w:id="56"/>
       <w:r>
@@ -8302,7 +8420,7 @@
         <w:pStyle w:val="Heading1"/>
         <w:rPr/>
       </w:pPr>
-      <w:bookmarkStart w:id="58" w:name="__RefHeading___Toc2204_1208937142"/>
+      <w:bookmarkStart w:id="58" w:name="__RefHeading___Toc2252_1986438947"/>
       <w:bookmarkStart w:id="59" w:name="безопасность"/>
       <w:bookmarkEnd w:id="58"/>
       <w:r>
@@ -8434,7 +8552,7 @@
         <w:pStyle w:val="Heading1"/>
         <w:rPr/>
       </w:pPr>
-      <w:bookmarkStart w:id="61" w:name="__RefHeading___Toc2206_1208937142"/>
+      <w:bookmarkStart w:id="61" w:name="__RefHeading___Toc2254_1986438947"/>
       <w:bookmarkStart w:id="62" w:name="масштабирование"/>
       <w:bookmarkEnd w:id="61"/>
       <w:r>
@@ -8527,7 +8645,7 @@
         <w:pStyle w:val="Heading1"/>
         <w:rPr/>
       </w:pPr>
-      <w:bookmarkStart w:id="63" w:name="__RefHeading___Toc2208_1208937142"/>
+      <w:bookmarkStart w:id="63" w:name="__RefHeading___Toc2256_1986438947"/>
       <w:bookmarkStart w:id="64" w:name="Xe0b46952fee8bc72ba399f90b2ae089e5d10a04"/>
       <w:bookmarkEnd w:id="63"/>
       <w:r>
@@ -8939,7 +9057,7 @@
         <w:pStyle w:val="Heading1"/>
         <w:rPr/>
       </w:pPr>
-      <w:bookmarkStart w:id="65" w:name="__RefHeading___Toc2210_1208937142"/>
+      <w:bookmarkStart w:id="65" w:name="__RefHeading___Toc2258_1986438947"/>
       <w:bookmarkStart w:id="66" w:name="установка-в-закрытом-контуре"/>
       <w:bookmarkEnd w:id="65"/>
       <w:r>
@@ -9063,7 +9181,7 @@
         <w:rPr>
           <w:rStyle w:val="NormalTok"/>
         </w:rPr>
-        <w:t xml:space="preserve"> puls-0.4.0-images.tar.gz</w:t>
+        <w:t xml:space="preserve"> puls-0.5.0-images.tar.gz</w:t>
       </w:r>
     </w:p>
     <w:p>
@@ -9103,7 +9221,7 @@
         <w:rPr>
           <w:rStyle w:val="NormalTok"/>
         </w:rPr>
-        <w:t xml:space="preserve"> puls-0.4.0-images.tar.gz </w:t>
+        <w:t xml:space="preserve"> puls-0.5.0-images.tar.gz </w:t>
       </w:r>
       <w:r>
         <w:rPr>
@@ -9216,7 +9334,7 @@
         <w:pStyle w:val="Heading1"/>
         <w:rPr/>
       </w:pPr>
-      <w:bookmarkStart w:id="67" w:name="__RefHeading___Toc2212_1208937142"/>
+      <w:bookmarkStart w:id="67" w:name="__RefHeading___Toc2260_1986438947"/>
       <w:bookmarkEnd w:id="67"/>
       <w:r>
         <w:rPr>
@@ -9852,7 +9970,7 @@
                 <w:szCs w:val="24"/>
                 <w:lang w:val="ru-RU" w:eastAsia="en-US" w:bidi="ar-SA"/>
               </w:rPr>
-              <w:t>«Настройки → Вход через домен → Проверить подключение»; доступность сервера каталога из контейнера</w:t>
+              <w:t>«Интеграции → Вход через домен → Проверить подключение»; доступность сервера каталога из контейнера</w:t>
             </w:r>
           </w:p>
         </w:tc>
@@ -10462,7 +10580,7 @@
         <w:pStyle w:val="Heading1"/>
         <w:rPr/>
       </w:pPr>
-      <w:bookmarkStart w:id="69" w:name="__RefHeading___Toc2214_1208937142"/>
+      <w:bookmarkStart w:id="69" w:name="__RefHeading___Toc2262_1986438947"/>
       <w:bookmarkEnd w:id="69"/>
       <w:r>
         <w:rPr>
@@ -10983,7 +11101,7 @@
         <w:color w:val="8A92A6"/>
         <w:sz w:val="16"/>
       </w:rPr>
-      <w:t xml:space="preserve">Пульс Проекта 0.4.0 · стр. </w:t>
+      <w:t xml:space="preserve">Пульс Проекта 0.5.0 · стр. </w:t>
     </w:r>
     <w:r>
       <w:rPr/>
@@ -11022,7 +11140,7 @@
         <w:color w:val="8A92A6"/>
         <w:sz w:val="16"/>
       </w:rPr>
-      <w:t xml:space="preserve">Пульс Проекта 0.4.0 · стр. </w:t>
+      <w:t xml:space="preserve">Пульс Проекта 0.5.0 · стр. </w:t>
     </w:r>
     <w:r>
       <w:rPr/>

</xml_diff>